<commit_message>
Add Ch 25 printed notes (main + index); drop photo credits from slide text
Co-Authored-By: Claude Opus 5.5 <noreply@anthropic.com>
Claude-Session: https://claude.ai/code/session_01UCsH9gqSSaKQv3czcDCA1B
</commit_message>
<xml_diff>
--- a/Printed Exam Notes/Ch 24 Printed Notes.docx
+++ b/Printed Exam Notes/Ch 24 Printed Notes.docx
@@ -4319,6 +4319,56 @@
     </w:p>
     <w:p>
       <w:pPr>
+        <w:pStyle w:val="Figure"/>
+      </w:pPr>
+      <w:r>
+        <w:rPr>
+          <w:i/>
+        </w:rPr>
+        <w:t xml:space="preserve">Fig: </w:t>
+      </w:r>
+      <w:r>
+        <w:rPr/>
+        <w:t>Micrograph of a terminal bud shows hemispherical lateral bud, shoot apical meristem and immature leaf.</w:t>
+      </w:r>
+    </w:p>
+    <w:p>
+      <w:pPr>
+        <w:pStyle w:val="Figure"/>
+      </w:pPr>
+      <w:r>
+        <w:rPr>
+          <w:i/>
+        </w:rPr>
+        <w:t xml:space="preserve">Textbook caption: </w:t>
+      </w:r>
+      <w:r>
+        <w:rPr/>
+        <w:t>A terminal bud contains an apical meristem and produces new leaves and other tissues during primary growth. Lateral branches grow from the lateral bud.</w:t>
+      </w:r>
+    </w:p>
+    <w:p>
+      <w:pPr>
+        <w:pStyle w:val="Slideheading"/>
+      </w:pPr>
+      <w:bookmarkStart w:id="27" w:name="s242022"/>
+      <w:r>
+        <w:rPr>
+          <w:rStyle w:val="Slidecode"/>
+          <w:b/>
+        </w:rPr>
+        <w:t>24.2.22</w:t>
+      </w:r>
+      <w:r>
+        <w:rPr>
+          <w:b/>
+        </w:rPr>
+        <w:t xml:space="preserve"> Monocots</w:t>
+      </w:r>
+      <w:bookmarkEnd w:id="27"/>
+    </w:p>
+    <w:p>
+      <w:pPr>
         <w:pStyle w:val="Bullet"/>
         <w:numPr>
           <w:ilvl w:val="0"/>
@@ -4327,58 +4377,8 @@
       </w:pPr>
       <w:r>
         <w:rPr/>
-        <w:t>Steven P. Lynch</w:t>
-      </w:r>
-    </w:p>
-    <w:p>
-      <w:pPr>
-        <w:pStyle w:val="Figure"/>
-      </w:pPr>
-      <w:r>
-        <w:rPr>
-          <w:i/>
-        </w:rPr>
-        <w:t xml:space="preserve">Fig: </w:t>
-      </w:r>
-      <w:r>
-        <w:rPr/>
-        <w:t>Micrograph of a terminal bud shows hemispherical lateral bud, shoot apical meristem and immature leaf.</w:t>
-      </w:r>
-    </w:p>
-    <w:p>
-      <w:pPr>
-        <w:pStyle w:val="Figure"/>
-      </w:pPr>
-      <w:r>
-        <w:rPr>
-          <w:i/>
-        </w:rPr>
-        <w:t xml:space="preserve">Textbook caption: </w:t>
-      </w:r>
-      <w:r>
-        <w:rPr/>
-        <w:t>A terminal bud contains an apical meristem and produces new leaves and other tissues during primary growth. Lateral branches grow from the lateral bud.</w:t>
-      </w:r>
-    </w:p>
-    <w:p>
-      <w:pPr>
-        <w:pStyle w:val="Slideheading"/>
-      </w:pPr>
-      <w:bookmarkStart w:id="27" w:name="s242022"/>
-      <w:r>
-        <w:rPr>
-          <w:rStyle w:val="Slidecode"/>
-          <w:b/>
-        </w:rPr>
-        <w:t>24.2.22</w:t>
-      </w:r>
-      <w:r>
-        <w:rPr>
-          <w:b/>
-        </w:rPr>
-        <w:t xml:space="preserve"> Monocots</w:t>
-      </w:r>
-      <w:bookmarkEnd w:id="27"/>
+        <w:t>Variations of organs and organ systems lead to classification as a monocot or eudicot</w:t>
+      </w:r>
     </w:p>
     <w:p>
       <w:pPr>
@@ -4390,8 +4390,93 @@
       </w:pPr>
       <w:r>
         <w:rPr/>
-        <w:t>Variations of organs and organ systems lead to classification as a monocot or eudicot</w:t>
-      </w:r>
+        <w:t>Monocots (single cotyledon)</w:t>
+      </w:r>
+    </w:p>
+    <w:p>
+      <w:pPr>
+        <w:pStyle w:val="Bullet"/>
+        <w:numPr>
+          <w:ilvl w:val="1"/>
+          <w:numId w:val="90"/>
+        </w:numPr>
+      </w:pPr>
+      <w:r>
+        <w:rPr/>
+        <w:t>Cotyledons act as transfer tissue.</w:t>
+      </w:r>
+    </w:p>
+    <w:p>
+      <w:pPr>
+        <w:pStyle w:val="Bullet"/>
+        <w:numPr>
+          <w:ilvl w:val="2"/>
+          <w:numId w:val="90"/>
+        </w:numPr>
+      </w:pPr>
+      <w:r>
+        <w:rPr/>
+        <w:t>Nutrients are derived from the endosperm.</w:t>
+      </w:r>
+    </w:p>
+    <w:p>
+      <w:pPr>
+        <w:pStyle w:val="Bullet"/>
+        <w:numPr>
+          <w:ilvl w:val="1"/>
+          <w:numId w:val="90"/>
+        </w:numPr>
+      </w:pPr>
+      <w:r>
+        <w:rPr/>
+        <w:t>Root vascular tissue occurs in a ring.</w:t>
+      </w:r>
+    </w:p>
+    <w:p>
+      <w:pPr>
+        <w:pStyle w:val="Bullet"/>
+        <w:numPr>
+          <w:ilvl w:val="1"/>
+          <w:numId w:val="90"/>
+        </w:numPr>
+      </w:pPr>
+      <w:r>
+        <w:rPr/>
+        <w:t>Leaves have a parallel venation.</w:t>
+      </w:r>
+    </w:p>
+    <w:p>
+      <w:pPr>
+        <w:pStyle w:val="Bullet"/>
+        <w:numPr>
+          <w:ilvl w:val="1"/>
+          <w:numId w:val="90"/>
+        </w:numPr>
+      </w:pPr>
+      <w:r>
+        <w:rPr/>
+        <w:t>Flower parts are arranged in multiples of three.</w:t>
+      </w:r>
+    </w:p>
+    <w:p>
+      <w:pPr>
+        <w:pStyle w:val="Slideheading"/>
+      </w:pPr>
+      <w:bookmarkStart w:id="28" w:name="s242023"/>
+      <w:r>
+        <w:rPr>
+          <w:rStyle w:val="Slidecode"/>
+          <w:b/>
+        </w:rPr>
+        <w:t>24.2.23</w:t>
+      </w:r>
+      <w:r>
+        <w:rPr>
+          <w:b/>
+        </w:rPr>
+        <w:t xml:space="preserve"> Eudicots</w:t>
+      </w:r>
+      <w:bookmarkEnd w:id="28"/>
     </w:p>
     <w:p>
       <w:pPr>
@@ -4403,7 +4488,7 @@
       </w:pPr>
       <w:r>
         <w:rPr/>
-        <w:t>Monocots (single cotyledon)</w:t>
+        <w:t>Eudicots (two cotyledons)</w:t>
       </w:r>
     </w:p>
     <w:p>
@@ -4416,7 +4501,884 @@
       </w:pPr>
       <w:r>
         <w:rPr/>
-        <w:t>Cotyledons act as transfer tissue.</w:t>
+        <w:t>Cotyledons supply nutrients to seedlings.</w:t>
+      </w:r>
+    </w:p>
+    <w:p>
+      <w:pPr>
+        <w:pStyle w:val="Bullet"/>
+        <w:numPr>
+          <w:ilvl w:val="1"/>
+          <w:numId w:val="90"/>
+        </w:numPr>
+      </w:pPr>
+      <w:r>
+        <w:rPr/>
+        <w:t>Root phloem is located between xylem arms.</w:t>
+      </w:r>
+    </w:p>
+    <w:p>
+      <w:pPr>
+        <w:pStyle w:val="Bullet"/>
+        <w:numPr>
+          <w:ilvl w:val="1"/>
+          <w:numId w:val="90"/>
+        </w:numPr>
+      </w:pPr>
+      <w:r>
+        <w:rPr/>
+        <w:t>Leaves have a netted venation.</w:t>
+      </w:r>
+    </w:p>
+    <w:p>
+      <w:pPr>
+        <w:pStyle w:val="Bullet"/>
+        <w:numPr>
+          <w:ilvl w:val="1"/>
+          <w:numId w:val="90"/>
+        </w:numPr>
+      </w:pPr>
+      <w:r>
+        <w:rPr/>
+        <w:t>Flower parts are arranged in multiples of four or five.</w:t>
+      </w:r>
+    </w:p>
+    <w:p>
+      <w:pPr>
+        <w:pStyle w:val="Slideheading"/>
+      </w:pPr>
+      <w:bookmarkStart w:id="29" w:name="s242024"/>
+      <w:r>
+        <w:rPr>
+          <w:rStyle w:val="Slidecode"/>
+          <w:b/>
+        </w:rPr>
+        <w:t>24.2.24</w:t>
+      </w:r>
+      <w:r>
+        <w:rPr>
+          <w:b/>
+        </w:rPr>
+        <w:t xml:space="preserve"> Flowering Plants Are Either Monocots or Eudicots</w:t>
+      </w:r>
+      <w:bookmarkEnd w:id="29"/>
+    </w:p>
+    <w:p>
+      <w:pPr>
+        <w:pStyle w:val="Figure"/>
+      </w:pPr>
+      <w:r>
+        <w:rPr>
+          <w:i/>
+        </w:rPr>
+        <w:t xml:space="preserve">Fig: </w:t>
+      </w:r>
+      <w:r>
+        <w:rPr/>
+        <w:t>Monocots: one cotyledon in seed, root xylem and phloem in a ring; vascular bundles scattered in stem; leaf veins form a parallel pattern; flower parts in threes and multiples of three; one pore or slit (pollen). Eudicots: two cotyledons in seed; root phloem between arms of xylem; vascular bundles in a distinct ring; leaf veins form a net pattern; flower parts in fours or fives and their multiples; three pores or slits (pollen).</w:t>
+      </w:r>
+    </w:p>
+    <w:p>
+      <w:pPr>
+        <w:pStyle w:val="Slideheading"/>
+      </w:pPr>
+      <w:bookmarkStart w:id="30" w:name="s242025"/>
+      <w:r>
+        <w:rPr>
+          <w:rStyle w:val="Slidecode"/>
+          <w:b/>
+        </w:rPr>
+        <w:t>24.2.25</w:t>
+      </w:r>
+      <w:r>
+        <w:rPr>
+          <w:b/>
+        </w:rPr>
+        <w:t xml:space="preserve"> Vegetative Organs and Plant Life Cycles</w:t>
+      </w:r>
+      <w:bookmarkEnd w:id="30"/>
+    </w:p>
+    <w:p>
+      <w:pPr>
+        <w:pStyle w:val="Bullet"/>
+        <w:numPr>
+          <w:ilvl w:val="0"/>
+          <w:numId w:val="90"/>
+        </w:numPr>
+      </w:pPr>
+      <w:r>
+        <w:rPr/>
+        <w:t>Annual plants live for only one growing season.</w:t>
+      </w:r>
+    </w:p>
+    <w:p>
+      <w:pPr>
+        <w:pStyle w:val="Bullet"/>
+        <w:numPr>
+          <w:ilvl w:val="1"/>
+          <w:numId w:val="90"/>
+        </w:numPr>
+      </w:pPr>
+      <w:r>
+        <w:rPr/>
+        <w:t>These produce enough vegetative structures to support flower and seeds.</w:t>
+      </w:r>
+    </w:p>
+    <w:p>
+      <w:pPr>
+        <w:pStyle w:val="Bullet"/>
+        <w:numPr>
+          <w:ilvl w:val="1"/>
+          <w:numId w:val="90"/>
+        </w:numPr>
+      </w:pPr>
+      <w:r>
+        <w:rPr/>
+        <w:t>After seed dispersal, the plant dies.</w:t>
+      </w:r>
+    </w:p>
+    <w:p>
+      <w:pPr>
+        <w:pStyle w:val="Bullet"/>
+        <w:numPr>
+          <w:ilvl w:val="0"/>
+          <w:numId w:val="90"/>
+        </w:numPr>
+      </w:pPr>
+      <w:r>
+        <w:rPr/>
+        <w:t>Perennial plants live for three or more seasons.</w:t>
+      </w:r>
+    </w:p>
+    <w:p>
+      <w:pPr>
+        <w:pStyle w:val="Bullet"/>
+        <w:numPr>
+          <w:ilvl w:val="1"/>
+          <w:numId w:val="90"/>
+        </w:numPr>
+      </w:pPr>
+      <w:r>
+        <w:rPr/>
+        <w:t>These spend energy making vegetative structures which help the plant survive for years.</w:t>
+      </w:r>
+    </w:p>
+    <w:p>
+      <w:pPr>
+        <w:pStyle w:val="Bullet"/>
+        <w:numPr>
+          <w:ilvl w:val="0"/>
+          <w:numId w:val="90"/>
+        </w:numPr>
+      </w:pPr>
+      <w:r>
+        <w:rPr/>
+        <w:t>Flower-inducing genes LEAFY and Apetala 1 are the difference between annuals and perennials.</w:t>
+      </w:r>
+    </w:p>
+    <w:p>
+      <w:pPr>
+        <w:pStyle w:val="Bullet"/>
+        <w:numPr>
+          <w:ilvl w:val="1"/>
+          <w:numId w:val="90"/>
+        </w:numPr>
+      </w:pPr>
+      <w:r>
+        <w:rPr/>
+        <w:t>They are genetic switches which determine whether a plant is an annual or a perennial.</w:t>
+      </w:r>
+    </w:p>
+    <w:p>
+      <w:pPr>
+        <w:pStyle w:val="Bullet"/>
+        <w:numPr>
+          <w:ilvl w:val="1"/>
+          <w:numId w:val="90"/>
+        </w:numPr>
+      </w:pPr>
+      <w:r>
+        <w:rPr/>
+        <w:t>Blocking flower-inducing genes in annuals induces perennial growth.</w:t>
+      </w:r>
+    </w:p>
+    <w:p>
+      <w:pPr>
+        <w:pStyle w:val="Sectionheading"/>
+      </w:pPr>
+      <w:r>
+        <w:rPr/>
+        <w:t>24.3 Organization and Diversity of Roots</w:t>
+      </w:r>
+    </w:p>
+    <w:p>
+      <w:pPr>
+        <w:pStyle w:val="Pointer"/>
+      </w:pPr>
+      <w:r>
+        <w:rPr/>
+        <w:t xml:space="preserve">Quick guide for this section: page </w:t>
+      </w:r>
+      <w:r>
+        <w:fldChar w:fldCharType="begin"/>
+      </w:r>
+      <w:r>
+        <w:instrText xml:space="preserve"> PAGEREF g243 \h </w:instrText>
+      </w:r>
+      <w:r>
+        <w:fldChar w:fldCharType="separate"/>
+      </w:r>
+      <w:r>
+        <w:t>2</w:t>
+      </w:r>
+      <w:r>
+        <w:fldChar w:fldCharType="end"/>
+      </w:r>
+    </w:p>
+    <w:p>
+      <w:pPr>
+        <w:pStyle w:val="Slideheading"/>
+      </w:pPr>
+      <w:bookmarkStart w:id="31" w:name="s243026"/>
+      <w:r>
+        <w:rPr>
+          <w:rStyle w:val="Slidecode"/>
+          <w:b/>
+        </w:rPr>
+        <w:t>24.3.26</w:t>
+      </w:r>
+      <w:bookmarkEnd w:id="31"/>
+    </w:p>
+    <w:p>
+      <w:pPr>
+        <w:pStyle w:val="Bullet"/>
+        <w:numPr>
+          <w:ilvl w:val="0"/>
+          <w:numId w:val="90"/>
+        </w:numPr>
+      </w:pPr>
+      <w:r>
+        <w:rPr/>
+        <w:t>In the eudicot root:</w:t>
+      </w:r>
+    </w:p>
+    <w:p>
+      <w:pPr>
+        <w:pStyle w:val="Bullet"/>
+        <w:numPr>
+          <w:ilvl w:val="1"/>
+          <w:numId w:val="90"/>
+        </w:numPr>
+      </w:pPr>
+      <w:r>
+        <w:rPr/>
+        <w:t>Root cap contains the root apical meristem.</w:t>
+      </w:r>
+    </w:p>
+    <w:p>
+      <w:pPr>
+        <w:pStyle w:val="Bullet"/>
+        <w:numPr>
+          <w:ilvl w:val="1"/>
+          <w:numId w:val="90"/>
+        </w:numPr>
+      </w:pPr>
+      <w:r>
+        <w:rPr/>
+        <w:t>Zone of cell division contains primary meristems.</w:t>
+      </w:r>
+    </w:p>
+    <w:p>
+      <w:pPr>
+        <w:pStyle w:val="Bullet"/>
+        <w:numPr>
+          <w:ilvl w:val="1"/>
+          <w:numId w:val="90"/>
+        </w:numPr>
+      </w:pPr>
+      <w:r>
+        <w:rPr/>
+        <w:t>Zone of elongation contains cells that are lengthening and becoming specialized.</w:t>
+      </w:r>
+    </w:p>
+    <w:p>
+      <w:pPr>
+        <w:pStyle w:val="Bullet"/>
+        <w:numPr>
+          <w:ilvl w:val="1"/>
+          <w:numId w:val="90"/>
+        </w:numPr>
+      </w:pPr>
+      <w:r>
+        <w:rPr/>
+        <w:t>Zone of maturation contains fully differentiated cells.</w:t>
+      </w:r>
+    </w:p>
+    <w:p>
+      <w:pPr>
+        <w:pStyle w:val="Slideheading"/>
+      </w:pPr>
+      <w:bookmarkStart w:id="32" w:name="s243027"/>
+      <w:r>
+        <w:rPr>
+          <w:rStyle w:val="Slidecode"/>
+          <w:b/>
+        </w:rPr>
+        <w:t>24.3.27</w:t>
+      </w:r>
+      <w:r>
+        <w:rPr>
+          <w:b/>
+        </w:rPr>
+        <w:t xml:space="preserve"> Tissues of Eudicot Root</w:t>
+      </w:r>
+      <w:bookmarkEnd w:id="32"/>
+    </w:p>
+    <w:p>
+      <w:pPr>
+        <w:pStyle w:val="Bullet"/>
+        <w:numPr>
+          <w:ilvl w:val="0"/>
+          <w:numId w:val="90"/>
+        </w:numPr>
+      </w:pPr>
+      <w:r>
+        <w:rPr/>
+        <w:t>Epidermis – Outer layer of root</w:t>
+      </w:r>
+    </w:p>
+    <w:p>
+      <w:pPr>
+        <w:pStyle w:val="Bullet"/>
+        <w:numPr>
+          <w:ilvl w:val="0"/>
+          <w:numId w:val="90"/>
+        </w:numPr>
+      </w:pPr>
+      <w:r>
+        <w:rPr/>
+        <w:t>Cortex – Composed of parenchyma cells, allowing water and minerals movement</w:t>
+      </w:r>
+    </w:p>
+    <w:p>
+      <w:pPr>
+        <w:pStyle w:val="Bullet"/>
+        <w:numPr>
+          <w:ilvl w:val="0"/>
+          <w:numId w:val="90"/>
+        </w:numPr>
+      </w:pPr>
+      <w:r>
+        <w:rPr/>
+        <w:t>Endodermis – Forms a boundary between cortex and inner vascular cylinder</w:t>
+      </w:r>
+    </w:p>
+    <w:p>
+      <w:pPr>
+        <w:pStyle w:val="Bullet"/>
+        <w:numPr>
+          <w:ilvl w:val="1"/>
+          <w:numId w:val="90"/>
+        </w:numPr>
+      </w:pPr>
+      <w:r>
+        <w:rPr/>
+        <w:t>Casparian strip is composed of protein lignin and suberin.</w:t>
+      </w:r>
+    </w:p>
+    <w:p>
+      <w:pPr>
+        <w:pStyle w:val="Bullet"/>
+        <w:numPr>
+          <w:ilvl w:val="0"/>
+          <w:numId w:val="90"/>
+        </w:numPr>
+      </w:pPr>
+      <w:r>
+        <w:rPr/>
+        <w:t>Pericycle – Mitotically active and is the starting point for development of branch or lateral roots</w:t>
+      </w:r>
+    </w:p>
+    <w:p>
+      <w:pPr>
+        <w:pStyle w:val="Correction"/>
+      </w:pPr>
+      <w:r>
+        <w:rPr>
+          <w:b/>
+          <w:i/>
+        </w:rPr>
+        <w:t xml:space="preserve">Textbook: </w:t>
+      </w:r>
+      <w:r>
+        <w:rPr/>
+        <w:t>Lignin isn't a protein (the textbook uses the same wording): it's a chemical that hardens cell walls, and suberin is a waxy, waterproof lipid. Together they make the Casparian strip waterproof, so water and minerals must pass through the endodermal cells.</w:t>
+      </w:r>
+    </w:p>
+    <w:p>
+      <w:pPr>
+        <w:pStyle w:val="Slideheading"/>
+      </w:pPr>
+      <w:bookmarkStart w:id="33" w:name="s243028"/>
+      <w:r>
+        <w:rPr>
+          <w:rStyle w:val="Slidecode"/>
+          <w:b/>
+        </w:rPr>
+        <w:t>24.3.28</w:t>
+      </w:r>
+      <w:r>
+        <w:rPr>
+          <w:b/>
+        </w:rPr>
+        <w:t xml:space="preserve"> Eudicot Root Tip</w:t>
+      </w:r>
+      <w:bookmarkEnd w:id="33"/>
+    </w:p>
+    <w:p>
+      <w:pPr>
+        <w:pStyle w:val="Figure"/>
+      </w:pPr>
+      <w:r>
+        <w:rPr>
+          <w:i/>
+        </w:rPr>
+        <w:t xml:space="preserve">Fig: </w:t>
+      </w:r>
+      <w:r>
+        <w:rPr/>
+        <w:t>A) Root tip: Diagram of root tips divides into zone of cell division, zone of elongation, zone of maturation and vascular cylinder on the top. Micrograph of zone of cell division shows multiple procambium, ground meristem, protoderm, root apical meristem protected by root cap and root cap. B) Vascular cylinder: Micrograph of vascular cylinder shows multiple circular endodermis, pericycle, phloem, large circular xylem in center and circular cortex, with epidermis and root hair. C) Casparian strip: Diagram shows layers of xylem, phloem, pericycle, endodermis and Casparian strip, cortex and epidermis with root hair (from where water and minerals flow in and out).</w:t>
+      </w:r>
+    </w:p>
+    <w:p>
+      <w:pPr>
+        <w:pStyle w:val="Slideheading"/>
+      </w:pPr>
+      <w:bookmarkStart w:id="34" w:name="s243029"/>
+      <w:r>
+        <w:rPr>
+          <w:rStyle w:val="Slidecode"/>
+          <w:b/>
+        </w:rPr>
+        <w:t>24.3.29</w:t>
+      </w:r>
+      <w:r>
+        <w:rPr>
+          <w:b/>
+        </w:rPr>
+        <w:t xml:space="preserve"> Branching of a Eudicot Root</w:t>
+      </w:r>
+      <w:bookmarkEnd w:id="34"/>
+    </w:p>
+    <w:p>
+      <w:pPr>
+        <w:pStyle w:val="Figure"/>
+      </w:pPr>
+      <w:r>
+        <w:rPr>
+          <w:i/>
+        </w:rPr>
+        <w:t xml:space="preserve">Fig: </w:t>
+      </w:r>
+      <w:r>
+        <w:rPr/>
+        <w:t>Diagram of branched eudicot root shows a branch root, pericycle, endodermis, cortex in center and vascular tissue in core.</w:t>
+      </w:r>
+    </w:p>
+    <w:p>
+      <w:pPr>
+        <w:pStyle w:val="Figure"/>
+      </w:pPr>
+      <w:r>
+        <w:rPr>
+          <w:i/>
+        </w:rPr>
+        <w:t xml:space="preserve">Textbook caption: </w:t>
+      </w:r>
+      <w:r>
+        <w:rPr/>
+        <w:t>This cross section of a willow, Salix, shows the origination and growth of a branch root from the pericycle.</w:t>
+      </w:r>
+    </w:p>
+    <w:p>
+      <w:pPr>
+        <w:pStyle w:val="Slideheading"/>
+      </w:pPr>
+      <w:bookmarkStart w:id="35" w:name="s243030"/>
+      <w:r>
+        <w:rPr>
+          <w:rStyle w:val="Slidecode"/>
+          <w:b/>
+        </w:rPr>
+        <w:t>24.3.30</w:t>
+      </w:r>
+      <w:r>
+        <w:rPr>
+          <w:b/>
+        </w:rPr>
+        <w:t xml:space="preserve"> Organization of Monocot Roots</w:t>
+      </w:r>
+      <w:bookmarkEnd w:id="35"/>
+    </w:p>
+    <w:p>
+      <w:pPr>
+        <w:pStyle w:val="Bullet"/>
+        <w:numPr>
+          <w:ilvl w:val="0"/>
+          <w:numId w:val="90"/>
+        </w:numPr>
+      </w:pPr>
+      <w:r>
+        <w:rPr/>
+        <w:t>The ground tissue of root’s pith is surrounded by a vascular ring.</w:t>
+      </w:r>
+    </w:p>
+    <w:p>
+      <w:pPr>
+        <w:pStyle w:val="Bullet"/>
+        <w:numPr>
+          <w:ilvl w:val="0"/>
+          <w:numId w:val="90"/>
+        </w:numPr>
+      </w:pPr>
+      <w:r>
+        <w:rPr/>
+        <w:t>They have the same growth zones as eudicot roots, but do not undergo secondary growth.</w:t>
+      </w:r>
+    </w:p>
+    <w:p>
+      <w:pPr>
+        <w:pStyle w:val="Bullet"/>
+        <w:numPr>
+          <w:ilvl w:val="0"/>
+          <w:numId w:val="90"/>
+        </w:numPr>
+      </w:pPr>
+      <w:r>
+        <w:rPr/>
+        <w:t>They have pericycle, endodermis, cortex, and epidermis.</w:t>
+      </w:r>
+    </w:p>
+    <w:p>
+      <w:pPr>
+        <w:pStyle w:val="Slideheading"/>
+      </w:pPr>
+      <w:bookmarkStart w:id="36" w:name="s243031"/>
+      <w:r>
+        <w:rPr>
+          <w:rStyle w:val="Slidecode"/>
+          <w:b/>
+        </w:rPr>
+        <w:t>24.3.31</w:t>
+      </w:r>
+      <w:r>
+        <w:rPr>
+          <w:b/>
+        </w:rPr>
+        <w:t xml:space="preserve"> Monocot Root</w:t>
+      </w:r>
+      <w:bookmarkEnd w:id="36"/>
+    </w:p>
+    <w:p>
+      <w:pPr>
+        <w:pStyle w:val="Figure"/>
+      </w:pPr>
+      <w:r>
+        <w:rPr>
+          <w:i/>
+        </w:rPr>
+        <w:t xml:space="preserve">Fig: </w:t>
+      </w:r>
+      <w:r>
+        <w:rPr/>
+        <w:t>Diagram and micrograph of monocot root shows circular pith, phloem, multiple pericycle, endodermis with Casparian strip, xylem, cortex and epidermis.</w:t>
+      </w:r>
+    </w:p>
+    <w:p>
+      <w:pPr>
+        <w:pStyle w:val="Figure"/>
+      </w:pPr>
+      <w:r>
+        <w:rPr>
+          <w:i/>
+        </w:rPr>
+        <w:t xml:space="preserve">Textbook caption: </w:t>
+      </w:r>
+      <w:r>
+        <w:rPr/>
+        <w:t>In this overall cross section, it is possible to observe that a vascular ring surrounds a central pith.</w:t>
+      </w:r>
+    </w:p>
+    <w:p>
+      <w:pPr>
+        <w:pStyle w:val="Slideheading"/>
+      </w:pPr>
+      <w:bookmarkStart w:id="37" w:name="s243032"/>
+      <w:r>
+        <w:rPr>
+          <w:rStyle w:val="Slidecode"/>
+          <w:b/>
+        </w:rPr>
+        <w:t>24.3.32</w:t>
+      </w:r>
+      <w:r>
+        <w:rPr>
+          <w:b/>
+        </w:rPr>
+        <w:t xml:space="preserve"> Root Diversity</w:t>
+      </w:r>
+      <w:bookmarkEnd w:id="37"/>
+    </w:p>
+    <w:p>
+      <w:pPr>
+        <w:pStyle w:val="Bullet"/>
+        <w:numPr>
+          <w:ilvl w:val="0"/>
+          <w:numId w:val="90"/>
+        </w:numPr>
+      </w:pPr>
+      <w:r>
+        <w:rPr/>
+        <w:t>Primary root (taproot) – Fleshy, long single root, that grows straight down</w:t>
+      </w:r>
+    </w:p>
+    <w:p>
+      <w:pPr>
+        <w:pStyle w:val="Bullet"/>
+        <w:numPr>
+          <w:ilvl w:val="1"/>
+          <w:numId w:val="90"/>
+        </w:numPr>
+      </w:pPr>
+      <w:r>
+        <w:rPr/>
+        <w:t>Stores food</w:t>
+      </w:r>
+    </w:p>
+    <w:p>
+      <w:pPr>
+        <w:pStyle w:val="Bullet"/>
+        <w:numPr>
+          <w:ilvl w:val="0"/>
+          <w:numId w:val="90"/>
+        </w:numPr>
+      </w:pPr>
+      <w:r>
+        <w:rPr/>
+        <w:t>Fibrous root system – Slender roots and lateral branches</w:t>
+      </w:r>
+    </w:p>
+    <w:p>
+      <w:pPr>
+        <w:pStyle w:val="Bullet"/>
+        <w:numPr>
+          <w:ilvl w:val="1"/>
+          <w:numId w:val="90"/>
+        </w:numPr>
+      </w:pPr>
+      <w:r>
+        <w:rPr/>
+        <w:t>Anchors plant to soil</w:t>
+      </w:r>
+    </w:p>
+    <w:p>
+      <w:pPr>
+        <w:pStyle w:val="Bullet"/>
+        <w:numPr>
+          <w:ilvl w:val="1"/>
+          <w:numId w:val="90"/>
+        </w:numPr>
+      </w:pPr>
+      <w:r>
+        <w:rPr/>
+        <w:t>Found in monocots</w:t>
+      </w:r>
+    </w:p>
+    <w:p>
+      <w:pPr>
+        <w:pStyle w:val="Bullet"/>
+        <w:numPr>
+          <w:ilvl w:val="0"/>
+          <w:numId w:val="90"/>
+        </w:numPr>
+      </w:pPr>
+      <w:r>
+        <w:rPr/>
+        <w:t>Some plants have roots that possess a variety of adaptations to better perform their functions.</w:t>
+      </w:r>
+    </w:p>
+    <w:p>
+      <w:pPr>
+        <w:pStyle w:val="Bullet"/>
+        <w:numPr>
+          <w:ilvl w:val="0"/>
+          <w:numId w:val="90"/>
+        </w:numPr>
+      </w:pPr>
+      <w:r>
+        <w:rPr/>
+        <w:t>Improve anchorage to the ground and support in high wind</w:t>
+      </w:r>
+    </w:p>
+    <w:p>
+      <w:pPr>
+        <w:pStyle w:val="Bullet"/>
+        <w:numPr>
+          <w:ilvl w:val="0"/>
+          <w:numId w:val="90"/>
+        </w:numPr>
+      </w:pPr>
+      <w:r>
+        <w:rPr/>
+        <w:t>Store large quantities of carbohydrate</w:t>
+      </w:r>
+    </w:p>
+    <w:p>
+      <w:pPr>
+        <w:pStyle w:val="Bullet"/>
+        <w:numPr>
+          <w:ilvl w:val="0"/>
+          <w:numId w:val="90"/>
+        </w:numPr>
+      </w:pPr>
+      <w:r>
+        <w:rPr/>
+        <w:t>Increase absorption of water, minerals, oxygen, sunlight</w:t>
+      </w:r>
+    </w:p>
+    <w:p>
+      <w:pPr>
+        <w:pStyle w:val="Slideheading"/>
+      </w:pPr>
+      <w:bookmarkStart w:id="38" w:name="s243033"/>
+      <w:r>
+        <w:rPr>
+          <w:rStyle w:val="Slidecode"/>
+          <w:b/>
+        </w:rPr>
+        <w:t>24.3.33</w:t>
+      </w:r>
+      <w:r>
+        <w:rPr>
+          <w:b/>
+        </w:rPr>
+        <w:t xml:space="preserve"> Root Specializations</w:t>
+      </w:r>
+      <w:bookmarkEnd w:id="38"/>
+    </w:p>
+    <w:p>
+      <w:pPr>
+        <w:pStyle w:val="Figure"/>
+      </w:pPr>
+      <w:r>
+        <w:rPr>
+          <w:i/>
+        </w:rPr>
+        <w:t xml:space="preserve">Fig: </w:t>
+      </w:r>
+      <w:r>
+        <w:rPr/>
+        <w:t>Root specialization examples include: roots for storage; prop roots for support; pneumatophores for oxygen; multifunctioning aerial roots.</w:t>
+      </w:r>
+    </w:p>
+    <w:p>
+      <w:pPr>
+        <w:pStyle w:val="Figure"/>
+      </w:pPr>
+      <w:r>
+        <w:rPr>
+          <w:i/>
+        </w:rPr>
+        <w:t xml:space="preserve">Textbook: </w:t>
+      </w:r>
+      <w:r>
+        <w:rPr/>
+        <w:t>a. Sweet potato plants have food storage roots. b. Prop roots (corn) are specialized for support in high winds. c. Pneumatophores (mangrove, bald cypress) extend above the water's surface, so a tree living in water can acquire oxygen. d. The aerial roots of orchids offer physical support, water and nutrient uptake, and in some cases even photosynthesis; English ivy uses aerial roots to climb.</w:t>
+      </w:r>
+    </w:p>
+    <w:p>
+      <w:pPr>
+        <w:pStyle w:val="Slideheading"/>
+      </w:pPr>
+      <w:bookmarkStart w:id="39" w:name="s243034"/>
+      <w:r>
+        <w:rPr>
+          <w:rStyle w:val="Slidecode"/>
+          <w:b/>
+        </w:rPr>
+        <w:t>24.3.34</w:t>
+      </w:r>
+      <w:r>
+        <w:rPr>
+          <w:b/>
+        </w:rPr>
+        <w:t xml:space="preserve"> Root Symbiotic Relationships</w:t>
+      </w:r>
+      <w:bookmarkEnd w:id="39"/>
+    </w:p>
+    <w:p>
+      <w:pPr>
+        <w:pStyle w:val="Bullet"/>
+        <w:numPr>
+          <w:ilvl w:val="0"/>
+          <w:numId w:val="90"/>
+        </w:numPr>
+      </w:pPr>
+      <w:r>
+        <w:rPr/>
+        <w:t>Mycorrhizae:</w:t>
+      </w:r>
+    </w:p>
+    <w:p>
+      <w:pPr>
+        <w:pStyle w:val="Bullet"/>
+        <w:numPr>
+          <w:ilvl w:val="1"/>
+          <w:numId w:val="90"/>
+        </w:numPr>
+      </w:pPr>
+      <w:r>
+        <w:rPr/>
+        <w:t>Mutualistic associations between roots and fungi</w:t>
+      </w:r>
+    </w:p>
+    <w:p>
+      <w:pPr>
+        <w:pStyle w:val="Bullet"/>
+        <w:numPr>
+          <w:ilvl w:val="1"/>
+          <w:numId w:val="90"/>
+        </w:numPr>
+      </w:pPr>
+      <w:r>
+        <w:rPr/>
+        <w:t>Assist in water and mineral extraction</w:t>
+      </w:r>
+    </w:p>
+    <w:p>
+      <w:pPr>
+        <w:pStyle w:val="Bullet"/>
+        <w:numPr>
+          <w:ilvl w:val="0"/>
+          <w:numId w:val="90"/>
+        </w:numPr>
+      </w:pPr>
+      <w:r>
+        <w:rPr/>
+        <w:t>Root nodules:</w:t>
+      </w:r>
+    </w:p>
+    <w:p>
+      <w:pPr>
+        <w:pStyle w:val="Bullet"/>
+        <w:numPr>
+          <w:ilvl w:val="1"/>
+          <w:numId w:val="90"/>
+        </w:numPr>
+      </w:pPr>
+      <w:r>
+        <w:rPr/>
+        <w:t>Contain nitrogen-fixing bacteria</w:t>
       </w:r>
     </w:p>
     <w:p>
@@ -4429,7 +5391,80 @@
       </w:pPr>
       <w:r>
         <w:rPr/>
-        <w:t>Nutrients are derived from the endosperm.</w:t>
+        <w:t>Plants cannot extract nitrogen from air, but bacteria in nodules can take up and reduce atmospheric nitrogen.</w:t>
+      </w:r>
+    </w:p>
+    <w:p>
+      <w:pPr>
+        <w:pStyle w:val="Bullet"/>
+        <w:numPr>
+          <w:ilvl w:val="2"/>
+          <w:numId w:val="90"/>
+        </w:numPr>
+      </w:pPr>
+      <w:r>
+        <w:rPr/>
+        <w:t>Plants get nitrogen from bacteria, which receive carbohydrates from the plant.</w:t>
+      </w:r>
+    </w:p>
+    <w:p>
+      <w:pPr>
+        <w:pStyle w:val="Sectionheading"/>
+      </w:pPr>
+      <w:r>
+        <w:rPr/>
+        <w:t>24.4 Organization and Diversity of Stems</w:t>
+      </w:r>
+    </w:p>
+    <w:p>
+      <w:pPr>
+        <w:pStyle w:val="Pointer"/>
+      </w:pPr>
+      <w:r>
+        <w:rPr/>
+        <w:t xml:space="preserve">Quick guide for this section: page </w:t>
+      </w:r>
+      <w:r>
+        <w:fldChar w:fldCharType="begin"/>
+      </w:r>
+      <w:r>
+        <w:instrText xml:space="preserve"> PAGEREF g244 \h </w:instrText>
+      </w:r>
+      <w:r>
+        <w:fldChar w:fldCharType="separate"/>
+      </w:r>
+      <w:r>
+        <w:t>3</w:t>
+      </w:r>
+      <w:r>
+        <w:fldChar w:fldCharType="end"/>
+      </w:r>
+    </w:p>
+    <w:p>
+      <w:pPr>
+        <w:pStyle w:val="Slideheading"/>
+      </w:pPr>
+      <w:bookmarkStart w:id="40" w:name="s244035"/>
+      <w:r>
+        <w:rPr>
+          <w:rStyle w:val="Slidecode"/>
+          <w:b/>
+        </w:rPr>
+        <w:t>24.4.35</w:t>
+      </w:r>
+      <w:bookmarkEnd w:id="40"/>
+    </w:p>
+    <w:p>
+      <w:pPr>
+        <w:pStyle w:val="Bullet"/>
+        <w:numPr>
+          <w:ilvl w:val="0"/>
+          <w:numId w:val="90"/>
+        </w:numPr>
+      </w:pPr>
+      <w:r>
+        <w:rPr/>
+        <w:t>Anatomy of a woody twig:</w:t>
       </w:r>
     </w:p>
     <w:p>
@@ -4442,7 +5477,33 @@
       </w:pPr>
       <w:r>
         <w:rPr/>
-        <w:t>Root vascular tissue occurs in a ring.</w:t>
+        <w:t>Terminal bud contains the shoot tip protected by bud scales.</w:t>
+      </w:r>
+    </w:p>
+    <w:p>
+      <w:pPr>
+        <w:pStyle w:val="Bullet"/>
+        <w:numPr>
+          <w:ilvl w:val="2"/>
+          <w:numId w:val="90"/>
+        </w:numPr>
+      </w:pPr>
+      <w:r>
+        <w:rPr/>
+        <w:t>Each spring, bud scales drop, leaving a scar.</w:t>
+      </w:r>
+    </w:p>
+    <w:p>
+      <w:pPr>
+        <w:pStyle w:val="Bullet"/>
+        <w:numPr>
+          <w:ilvl w:val="2"/>
+          <w:numId w:val="90"/>
+        </w:numPr>
+      </w:pPr>
+      <w:r>
+        <w:rPr/>
+        <w:t>Each scar is one year of growth.</w:t>
       </w:r>
     </w:p>
     <w:p>
@@ -4455,7 +5516,214 @@
       </w:pPr>
       <w:r>
         <w:rPr/>
-        <w:t>Leaves have a parallel venation.</w:t>
+        <w:t>Shoot apical meristem</w:t>
+      </w:r>
+    </w:p>
+    <w:p>
+      <w:pPr>
+        <w:pStyle w:val="Bullet"/>
+        <w:numPr>
+          <w:ilvl w:val="2"/>
+          <w:numId w:val="90"/>
+        </w:numPr>
+      </w:pPr>
+      <w:r>
+        <w:rPr/>
+        <w:t>Produces new cells that elongate and increase stem length</w:t>
+      </w:r>
+    </w:p>
+    <w:p>
+      <w:pPr>
+        <w:pStyle w:val="Bullet"/>
+        <w:numPr>
+          <w:ilvl w:val="2"/>
+          <w:numId w:val="90"/>
+        </w:numPr>
+      </w:pPr>
+      <w:r>
+        <w:rPr/>
+        <w:t>Protected by terminal bud</w:t>
+      </w:r>
+    </w:p>
+    <w:p>
+      <w:pPr>
+        <w:pStyle w:val="Bullet"/>
+        <w:numPr>
+          <w:ilvl w:val="3"/>
+          <w:numId w:val="90"/>
+        </w:numPr>
+      </w:pPr>
+      <w:r>
+        <w:rPr/>
+        <w:t>Enveloped by leaf primordia</w:t>
+      </w:r>
+    </w:p>
+    <w:p>
+      <w:pPr>
+        <w:pStyle w:val="Bullet"/>
+        <w:numPr>
+          <w:ilvl w:val="3"/>
+          <w:numId w:val="90"/>
+        </w:numPr>
+      </w:pPr>
+      <w:r>
+        <w:rPr/>
+        <w:t>Specialized primary meristems</w:t>
+      </w:r>
+    </w:p>
+    <w:p>
+      <w:pPr>
+        <w:pStyle w:val="Bullet"/>
+        <w:numPr>
+          <w:ilvl w:val="4"/>
+          <w:numId w:val="90"/>
+        </w:numPr>
+      </w:pPr>
+      <w:r>
+        <w:rPr/>
+        <w:t>Protoderm – gives rise to the epidermis</w:t>
+      </w:r>
+    </w:p>
+    <w:p>
+      <w:pPr>
+        <w:pStyle w:val="Bullet"/>
+        <w:numPr>
+          <w:ilvl w:val="4"/>
+          <w:numId w:val="90"/>
+        </w:numPr>
+      </w:pPr>
+      <w:r>
+        <w:rPr/>
+        <w:t>Ground Meristem – gives rise to pith and cortex</w:t>
+      </w:r>
+    </w:p>
+    <w:p>
+      <w:pPr>
+        <w:pStyle w:val="Bullet"/>
+        <w:numPr>
+          <w:ilvl w:val="4"/>
+          <w:numId w:val="90"/>
+        </w:numPr>
+      </w:pPr>
+      <w:r>
+        <w:rPr/>
+        <w:t>Procambium – produces primary xylem and phloem</w:t>
+      </w:r>
+    </w:p>
+    <w:p>
+      <w:pPr>
+        <w:pStyle w:val="Bullet"/>
+        <w:numPr>
+          <w:ilvl w:val="2"/>
+          <w:numId w:val="90"/>
+        </w:numPr>
+      </w:pPr>
+      <w:r>
+        <w:rPr/>
+        <w:t>Mature vascular bundles contain vascular cambium.</w:t>
+      </w:r>
+    </w:p>
+    <w:p>
+      <w:pPr>
+        <w:pStyle w:val="Slideheading"/>
+      </w:pPr>
+      <w:bookmarkStart w:id="41" w:name="s244036"/>
+      <w:r>
+        <w:rPr>
+          <w:rStyle w:val="Slidecode"/>
+          <w:b/>
+        </w:rPr>
+        <w:t>24.4.36</w:t>
+      </w:r>
+      <w:r>
+        <w:rPr>
+          <w:b/>
+        </w:rPr>
+        <w:t xml:space="preserve"> Woody Twig</w:t>
+      </w:r>
+      <w:bookmarkEnd w:id="41"/>
+    </w:p>
+    <w:p>
+      <w:pPr>
+        <w:pStyle w:val="Figure"/>
+      </w:pPr>
+      <w:r>
+        <w:rPr>
+          <w:i/>
+        </w:rPr>
+        <w:t xml:space="preserve">Fig: </w:t>
+      </w:r>
+      <w:r>
+        <w:rPr/>
+        <w:t>Diagram shows lenticel, bud scale, terminal budscale scars, nodes, internode, axillary bud, leaf and bundle scars, stem, terminal bud and bud scale.</w:t>
+      </w:r>
+    </w:p>
+    <w:p>
+      <w:pPr>
+        <w:pStyle w:val="Slideheading"/>
+      </w:pPr>
+      <w:bookmarkStart w:id="42" w:name="s244037"/>
+      <w:r>
+        <w:rPr>
+          <w:rStyle w:val="Slidecode"/>
+          <w:b/>
+        </w:rPr>
+        <w:t>24.4.37</w:t>
+      </w:r>
+      <w:r>
+        <w:rPr>
+          <w:b/>
+        </w:rPr>
+        <w:t xml:space="preserve"> Shoot Tip and Primary Meristems</w:t>
+      </w:r>
+      <w:bookmarkEnd w:id="42"/>
+    </w:p>
+    <w:p>
+      <w:pPr>
+        <w:pStyle w:val="Figure"/>
+      </w:pPr>
+      <w:r>
+        <w:rPr>
+          <w:i/>
+        </w:rPr>
+        <w:t xml:space="preserve">Fig: </w:t>
+      </w:r>
+      <w:r>
+        <w:rPr/>
+        <w:t>A) Shoot tip: Diagram of shoot tips divides into three zones. Lower zone: It consists of longitudinal primary xylem and primary phloem. Middle zone: It consists of longitudinal vascular cambium and hemispherical axillary bud. Top zone: It consists of procambium, ground meristem, protoderm, shoot apical meristem and leaf primordium. B) Fate of primary meristems: Three Primary Meristems: It consists of protoderm on the outer radial area, ground meristem in the middle and procambium in the core. C) Primary Tissues: It consists of epidermis on the outermost radial area, cortex in the outer radial area and pith in the center. Enlarged diagram of vascular bundles show circular multiple pith, primary xylem, vascular cambium, primary phloem and cortex.</w:t>
+      </w:r>
+    </w:p>
+    <w:p>
+      <w:pPr>
+        <w:pStyle w:val="Slideheading"/>
+      </w:pPr>
+      <w:bookmarkStart w:id="43" w:name="s244038"/>
+      <w:r>
+        <w:rPr>
+          <w:rStyle w:val="Slidecode"/>
+          <w:b/>
+        </w:rPr>
+        <w:t>24.4.38</w:t>
+      </w:r>
+      <w:r>
+        <w:rPr>
+          <w:b/>
+        </w:rPr>
+        <w:t xml:space="preserve"> Herbaceous Stems</w:t>
+      </w:r>
+      <w:bookmarkEnd w:id="43"/>
+    </w:p>
+    <w:p>
+      <w:pPr>
+        <w:pStyle w:val="Bullet"/>
+        <w:numPr>
+          <w:ilvl w:val="0"/>
+          <w:numId w:val="90"/>
+        </w:numPr>
+      </w:pPr>
+      <w:r>
+        <w:rPr/>
+        <w:t>Mature, nonwoody stems exhibit only primary growth.</w:t>
       </w:r>
     </w:p>
     <w:p>
@@ -4468,28 +5736,137 @@
       </w:pPr>
       <w:r>
         <w:rPr/>
-        <w:t>Flower parts are arranged in multiples of three.</w:t>
+        <w:t>Outermost tissue is covered with waxy cuticle.</w:t>
+      </w:r>
+    </w:p>
+    <w:p>
+      <w:pPr>
+        <w:pStyle w:val="Bullet"/>
+        <w:numPr>
+          <w:ilvl w:val="1"/>
+          <w:numId w:val="90"/>
+        </w:numPr>
+      </w:pPr>
+      <w:r>
+        <w:rPr/>
+        <w:t>Stems have distinctive vascular bundles.</w:t>
+      </w:r>
+    </w:p>
+    <w:p>
+      <w:pPr>
+        <w:pStyle w:val="Bullet"/>
+        <w:numPr>
+          <w:ilvl w:val="2"/>
+          <w:numId w:val="90"/>
+        </w:numPr>
+      </w:pPr>
+      <w:r>
+        <w:rPr/>
+        <w:t>Herbaceous eudicots – vascular bundles arranged in distinct ring</w:t>
+      </w:r>
+    </w:p>
+    <w:p>
+      <w:pPr>
+        <w:pStyle w:val="Bullet"/>
+        <w:numPr>
+          <w:ilvl w:val="2"/>
+          <w:numId w:val="90"/>
+        </w:numPr>
+      </w:pPr>
+      <w:r>
+        <w:rPr/>
+        <w:t>Monocots – vascular bundles scattered throughout stem</w:t>
       </w:r>
     </w:p>
     <w:p>
       <w:pPr>
         <w:pStyle w:val="Slideheading"/>
       </w:pPr>
-      <w:bookmarkStart w:id="28" w:name="s242023"/>
+      <w:bookmarkStart w:id="44" w:name="s244039"/>
       <w:r>
         <w:rPr>
           <w:rStyle w:val="Slidecode"/>
           <w:b/>
         </w:rPr>
-        <w:t>24.2.23</w:t>
+        <w:t>24.4.39</w:t>
       </w:r>
       <w:r>
         <w:rPr>
           <w:b/>
         </w:rPr>
-        <w:t xml:space="preserve"> Eudicots</w:t>
-      </w:r>
-      <w:bookmarkEnd w:id="28"/>
+        <w:t xml:space="preserve"> Herbaceous Eudicot Stem</w:t>
+      </w:r>
+      <w:bookmarkEnd w:id="44"/>
+    </w:p>
+    <w:p>
+      <w:pPr>
+        <w:pStyle w:val="Figure"/>
+      </w:pPr>
+      <w:r>
+        <w:rPr>
+          <w:i/>
+        </w:rPr>
+        <w:t xml:space="preserve">Fig: </w:t>
+      </w:r>
+      <w:r>
+        <w:rPr/>
+        <w:t>Left panel: Diagram of herbaceous eudicot stem consists of cluster of pith in the center with cortex and epidermis. Right panel: Enlarged diagram of vascular bundles show circular multiple xylem, phloem, phloem fiber, circular pith, vascular cambium with set layers of parenchyma cells, collenchyma cells, and epidermis.</w:t>
+      </w:r>
+    </w:p>
+    <w:p>
+      <w:pPr>
+        <w:pStyle w:val="Slideheading"/>
+      </w:pPr>
+      <w:bookmarkStart w:id="45" w:name="s244040"/>
+      <w:r>
+        <w:rPr>
+          <w:rStyle w:val="Slidecode"/>
+          <w:b/>
+        </w:rPr>
+        <w:t>24.4.40</w:t>
+      </w:r>
+      <w:r>
+        <w:rPr>
+          <w:b/>
+        </w:rPr>
+        <w:t xml:space="preserve"> Monocot Stem</w:t>
+      </w:r>
+      <w:bookmarkEnd w:id="45"/>
+    </w:p>
+    <w:p>
+      <w:pPr>
+        <w:pStyle w:val="Figure"/>
+      </w:pPr>
+      <w:r>
+        <w:rPr>
+          <w:i/>
+        </w:rPr>
+        <w:t xml:space="preserve">Fig: </w:t>
+      </w:r>
+      <w:r>
+        <w:rPr/>
+        <w:t>Top panel: Micrograph shows ovular vascular bundles, ground tissue and epidermis. Right panel: Enlarged diagram of vascular bundle shows different sized circular layers of ground tissue (parenchyma), xylem, phloem, bundle sheath cells, sieve-tube member, air space, companion cell, and vessel element.</w:t>
+      </w:r>
+    </w:p>
+    <w:p>
+      <w:pPr>
+        <w:pStyle w:val="Slideheading"/>
+      </w:pPr>
+      <w:bookmarkStart w:id="46" w:name="s244041"/>
+      <w:r>
+        <w:rPr>
+          <w:rStyle w:val="Slidecode"/>
+          <w:b/>
+        </w:rPr>
+        <w:t>24.4.41</w:t>
+      </w:r>
+      <w:r>
+        <w:rPr>
+          <w:b/>
+        </w:rPr>
+        <w:t xml:space="preserve"> Woody Stems</w:t>
+      </w:r>
+      <w:bookmarkEnd w:id="46"/>
     </w:p>
     <w:p>
       <w:pPr>
@@ -4501,7 +5878,66 @@
       </w:pPr>
       <w:r>
         <w:rPr/>
-        <w:t>Eudicots (two cotyledons)</w:t>
+        <w:t>Woody plants have both primary and secondary tissues.</w:t>
+      </w:r>
+    </w:p>
+    <w:p>
+      <w:pPr>
+        <w:pStyle w:val="Bullet"/>
+        <w:numPr>
+          <w:ilvl w:val="2"/>
+          <w:numId w:val="90"/>
+        </w:numPr>
+      </w:pPr>
+      <w:r>
+        <w:rPr/>
+        <w:t>Primary tissues form each year from primary meristems.</w:t>
+      </w:r>
+    </w:p>
+    <w:p>
+      <w:pPr>
+        <w:pStyle w:val="Bullet"/>
+        <w:numPr>
+          <w:ilvl w:val="2"/>
+          <w:numId w:val="90"/>
+        </w:numPr>
+      </w:pPr>
+      <w:r>
+        <w:rPr/>
+        <w:t>Secondary tissues develop during first and subsequent years from lateral meristems.</w:t>
+      </w:r>
+    </w:p>
+    <w:p>
+      <w:pPr>
+        <w:pStyle w:val="Slideheading"/>
+      </w:pPr>
+      <w:bookmarkStart w:id="47" w:name="s244042"/>
+      <w:r>
+        <w:rPr>
+          <w:rStyle w:val="Slidecode"/>
+          <w:b/>
+        </w:rPr>
+        <w:t>24.4.42</w:t>
+      </w:r>
+      <w:r>
+        <w:rPr>
+          <w:b/>
+        </w:rPr>
+        <w:t xml:space="preserve"> Woody Stem Characteristics</w:t>
+      </w:r>
+      <w:bookmarkEnd w:id="47"/>
+    </w:p>
+    <w:p>
+      <w:pPr>
+        <w:pStyle w:val="Bullet"/>
+        <w:numPr>
+          <w:ilvl w:val="0"/>
+          <w:numId w:val="90"/>
+        </w:numPr>
+      </w:pPr>
+      <w:r>
+        <w:rPr/>
+        <w:t>Woody stems have both primary and secondary growth.</w:t>
       </w:r>
     </w:p>
     <w:p>
@@ -4514,7 +5950,7 @@
       </w:pPr>
       <w:r>
         <w:rPr/>
-        <w:t>Cotyledons supply nutrients to seedlings.</w:t>
+        <w:t>Primary growth increases the length of the plant.</w:t>
       </w:r>
     </w:p>
     <w:p>
@@ -4527,7 +5963,20 @@
       </w:pPr>
       <w:r>
         <w:rPr/>
-        <w:t>Root phloem is located between xylem arms.</w:t>
+        <w:t>Secondary growth increases the girth.</w:t>
+      </w:r>
+    </w:p>
+    <w:p>
+      <w:pPr>
+        <w:pStyle w:val="Bullet"/>
+        <w:numPr>
+          <w:ilvl w:val="0"/>
+          <w:numId w:val="90"/>
+        </w:numPr>
+      </w:pPr>
+      <w:r>
+        <w:rPr/>
+        <w:t>Woody stems have no vascular tissue, and instead have three distinct regions.</w:t>
       </w:r>
     </w:p>
     <w:p>
@@ -4540,7 +5989,7 @@
       </w:pPr>
       <w:r>
         <w:rPr/>
-        <w:t>Leaves have a netted venation.</w:t>
+        <w:t>Bark</w:t>
       </w:r>
     </w:p>
     <w:p>
@@ -4553,28 +6002,44 @@
       </w:pPr>
       <w:r>
         <w:rPr/>
-        <w:t>Flower parts are arranged in multiples of four or five.</w:t>
+        <w:t>Pith</w:t>
+      </w:r>
+    </w:p>
+    <w:p>
+      <w:pPr>
+        <w:pStyle w:val="Correction"/>
+      </w:pPr>
+      <w:r>
+        <w:rPr>
+          <w:b/>
+          <w:i/>
+        </w:rPr>
+        <w:t xml:space="preserve">Textbook: </w:t>
+      </w:r>
+      <w:r>
+        <w:rPr/>
+        <w:t>Woody stems are mostly vascular tissue: wood is secondary xylem, and bark contains secondary phloem (24.4.43–45). The three regions are bark, wood and pith (the slide leaves out wood). The professor confirmed this slide is wrong (Oct 22).</w:t>
       </w:r>
     </w:p>
     <w:p>
       <w:pPr>
         <w:pStyle w:val="Slideheading"/>
       </w:pPr>
-      <w:bookmarkStart w:id="29" w:name="s242024"/>
+      <w:bookmarkStart w:id="48" w:name="s244043"/>
       <w:r>
         <w:rPr>
           <w:rStyle w:val="Slidecode"/>
           <w:b/>
         </w:rPr>
-        <w:t>24.2.24</w:t>
+        <w:t>24.4.43</w:t>
       </w:r>
       <w:r>
         <w:rPr>
           <w:b/>
         </w:rPr>
-        <w:t xml:space="preserve"> Flowering Plants Are Either Monocots or Eudicots</w:t>
-      </w:r>
-      <w:bookmarkEnd w:id="29"/>
+        <w:t xml:space="preserve"> Diagrams of Secondary Growth of Stems</w:t>
+      </w:r>
+      <w:bookmarkEnd w:id="48"/>
     </w:p>
     <w:p>
       <w:pPr>
@@ -4588,28 +6053,28 @@
       </w:r>
       <w:r>
         <w:rPr/>
-        <w:t>Monocots: one cotyledon in seed, root xylem and phloem in a ring; vascular bundles scattered in stem; leaf veins form a parallel pattern; flower parts in threes and multiples of three; one pore or slit (pollen). Eudicots: two cotyledons in seed; root phloem between arms of xylem; vascular bundles in a distinct ring; leaf veins form a net pattern; flower parts in fours or fives and their multiples; three pores or slits (pollen).</w:t>
+        <w:t>Vascular cambium: lateral meristem that will produce secondary xylem and secondary phloem in each succeeding year. Periderm: As a stem becomes woody, epidermis is replaced by the periderm. Bark: includes periderm and living secondary phloem. Wood: Increases each year; includes annual rings of xylem.</w:t>
       </w:r>
     </w:p>
     <w:p>
       <w:pPr>
         <w:pStyle w:val="Slideheading"/>
       </w:pPr>
-      <w:bookmarkStart w:id="30" w:name="s242025"/>
+      <w:bookmarkStart w:id="49" w:name="s244044"/>
       <w:r>
         <w:rPr>
           <w:rStyle w:val="Slidecode"/>
           <w:b/>
         </w:rPr>
-        <w:t>24.2.25</w:t>
+        <w:t>24.4.44</w:t>
       </w:r>
       <w:r>
         <w:rPr>
           <w:b/>
         </w:rPr>
-        <w:t xml:space="preserve"> Vegetative Organs and Plant Life Cycles</w:t>
-      </w:r>
-      <w:bookmarkEnd w:id="30"/>
+        <w:t xml:space="preserve"> Bark</w:t>
+      </w:r>
+      <w:bookmarkEnd w:id="49"/>
     </w:p>
     <w:p>
       <w:pPr>
@@ -4621,7 +6086,46 @@
       </w:pPr>
       <w:r>
         <w:rPr/>
-        <w:t>Annual plants live for only one growing season.</w:t>
+        <w:t>Bark of a tree contains cork, cork cambium, cortex, and phloem.</w:t>
+      </w:r>
+    </w:p>
+    <w:p>
+      <w:pPr>
+        <w:pStyle w:val="Bullet"/>
+        <w:numPr>
+          <w:ilvl w:val="0"/>
+          <w:numId w:val="90"/>
+        </w:numPr>
+      </w:pPr>
+      <w:r>
+        <w:rPr/>
+        <w:t>Bark can be removed, but it is harmful to the plant due to lack of organic nutrient transport.</w:t>
+      </w:r>
+    </w:p>
+    <w:p>
+      <w:pPr>
+        <w:pStyle w:val="Bullet"/>
+        <w:numPr>
+          <w:ilvl w:val="0"/>
+          <w:numId w:val="90"/>
+        </w:numPr>
+      </w:pPr>
+      <w:r>
+        <w:rPr/>
+        <w:t>Girdling, removing bark from around the tree, leads to the death of the tree.</w:t>
+      </w:r>
+    </w:p>
+    <w:p>
+      <w:pPr>
+        <w:pStyle w:val="Bullet"/>
+        <w:numPr>
+          <w:ilvl w:val="0"/>
+          <w:numId w:val="90"/>
+        </w:numPr>
+      </w:pPr>
+      <w:r>
+        <w:rPr/>
+        <w:t>Cork cells are impregnated with suberin.</w:t>
       </w:r>
     </w:p>
     <w:p>
@@ -4634,7 +6138,40 @@
       </w:pPr>
       <w:r>
         <w:rPr/>
-        <w:t>These produce enough vegetative structures to support flower and seeds.</w:t>
+        <w:t>Gas exchange is impeded except at lenticels.</w:t>
+      </w:r>
+    </w:p>
+    <w:p>
+      <w:pPr>
+        <w:pStyle w:val="Slideheading"/>
+      </w:pPr>
+      <w:bookmarkStart w:id="50" w:name="s244045"/>
+      <w:r>
+        <w:rPr>
+          <w:rStyle w:val="Slidecode"/>
+          <w:b/>
+        </w:rPr>
+        <w:t>24.4.45</w:t>
+      </w:r>
+      <w:r>
+        <w:rPr>
+          <w:b/>
+        </w:rPr>
+        <w:t xml:space="preserve"> Wood</w:t>
+      </w:r>
+      <w:bookmarkEnd w:id="50"/>
+    </w:p>
+    <w:p>
+      <w:pPr>
+        <w:pStyle w:val="Bullet"/>
+        <w:numPr>
+          <w:ilvl w:val="0"/>
+          <w:numId w:val="90"/>
+        </w:numPr>
+      </w:pPr>
+      <w:r>
+        <w:rPr/>
+        <w:t>Wood is secondary xylem that builds up year after year.</w:t>
       </w:r>
     </w:p>
     <w:p>
@@ -4647,7 +6184,33 @@
       </w:pPr>
       <w:r>
         <w:rPr/>
-        <w:t>After seed dispersal, the plant dies.</w:t>
+        <w:t>Vascular cambium is dormant during winter.</w:t>
+      </w:r>
+    </w:p>
+    <w:p>
+      <w:pPr>
+        <w:pStyle w:val="Bullet"/>
+        <w:numPr>
+          <w:ilvl w:val="1"/>
+          <w:numId w:val="90"/>
+        </w:numPr>
+      </w:pPr>
+      <w:r>
+        <w:rPr/>
+        <w:t>Annual ring is made up of spring wood and summer wood.</w:t>
+      </w:r>
+    </w:p>
+    <w:p>
+      <w:pPr>
+        <w:pStyle w:val="Bullet"/>
+        <w:numPr>
+          <w:ilvl w:val="2"/>
+          <w:numId w:val="90"/>
+        </w:numPr>
+      </w:pPr>
+      <w:r>
+        <w:rPr/>
+        <w:t>Summer wood has a lower proportion of vessels than spring wood.</w:t>
       </w:r>
     </w:p>
     <w:p>
@@ -4660,1582 +6223,6 @@
       </w:pPr>
       <w:r>
         <w:rPr/>
-        <w:t>Perennial plants live for three or more seasons.</w:t>
-      </w:r>
-    </w:p>
-    <w:p>
-      <w:pPr>
-        <w:pStyle w:val="Bullet"/>
-        <w:numPr>
-          <w:ilvl w:val="1"/>
-          <w:numId w:val="90"/>
-        </w:numPr>
-      </w:pPr>
-      <w:r>
-        <w:rPr/>
-        <w:t>These spend energy making vegetative structures which help the plant survive for years.</w:t>
-      </w:r>
-    </w:p>
-    <w:p>
-      <w:pPr>
-        <w:pStyle w:val="Bullet"/>
-        <w:numPr>
-          <w:ilvl w:val="0"/>
-          <w:numId w:val="90"/>
-        </w:numPr>
-      </w:pPr>
-      <w:r>
-        <w:rPr/>
-        <w:t>Flower-inducing genes LEAFY and Apetala 1 are the difference between annuals and perennials.</w:t>
-      </w:r>
-    </w:p>
-    <w:p>
-      <w:pPr>
-        <w:pStyle w:val="Bullet"/>
-        <w:numPr>
-          <w:ilvl w:val="1"/>
-          <w:numId w:val="90"/>
-        </w:numPr>
-      </w:pPr>
-      <w:r>
-        <w:rPr/>
-        <w:t>They are genetic switches which determine whether a plant is an annual or a perennial.</w:t>
-      </w:r>
-    </w:p>
-    <w:p>
-      <w:pPr>
-        <w:pStyle w:val="Bullet"/>
-        <w:numPr>
-          <w:ilvl w:val="1"/>
-          <w:numId w:val="90"/>
-        </w:numPr>
-      </w:pPr>
-      <w:r>
-        <w:rPr/>
-        <w:t>Blocking flower-inducing genes in annuals induces perennial growth.</w:t>
-      </w:r>
-    </w:p>
-    <w:p>
-      <w:pPr>
-        <w:pStyle w:val="Sectionheading"/>
-      </w:pPr>
-      <w:r>
-        <w:rPr/>
-        <w:t>24.3 Organization and Diversity of Roots</w:t>
-      </w:r>
-    </w:p>
-    <w:p>
-      <w:pPr>
-        <w:pStyle w:val="Pointer"/>
-      </w:pPr>
-      <w:r>
-        <w:rPr/>
-        <w:t xml:space="preserve">Quick guide for this section: page </w:t>
-      </w:r>
-      <w:r>
-        <w:fldChar w:fldCharType="begin"/>
-      </w:r>
-      <w:r>
-        <w:instrText xml:space="preserve"> PAGEREF g243 \h </w:instrText>
-      </w:r>
-      <w:r>
-        <w:fldChar w:fldCharType="separate"/>
-      </w:r>
-      <w:r>
-        <w:t>2</w:t>
-      </w:r>
-      <w:r>
-        <w:fldChar w:fldCharType="end"/>
-      </w:r>
-    </w:p>
-    <w:p>
-      <w:pPr>
-        <w:pStyle w:val="Slideheading"/>
-      </w:pPr>
-      <w:bookmarkStart w:id="31" w:name="s243026"/>
-      <w:r>
-        <w:rPr>
-          <w:rStyle w:val="Slidecode"/>
-          <w:b/>
-        </w:rPr>
-        <w:t>24.3.26</w:t>
-      </w:r>
-      <w:bookmarkEnd w:id="31"/>
-    </w:p>
-    <w:p>
-      <w:pPr>
-        <w:pStyle w:val="Bullet"/>
-        <w:numPr>
-          <w:ilvl w:val="0"/>
-          <w:numId w:val="90"/>
-        </w:numPr>
-      </w:pPr>
-      <w:r>
-        <w:rPr/>
-        <w:t>In the eudicot root:</w:t>
-      </w:r>
-    </w:p>
-    <w:p>
-      <w:pPr>
-        <w:pStyle w:val="Bullet"/>
-        <w:numPr>
-          <w:ilvl w:val="1"/>
-          <w:numId w:val="90"/>
-        </w:numPr>
-      </w:pPr>
-      <w:r>
-        <w:rPr/>
-        <w:t>Root cap contains the root apical meristem.</w:t>
-      </w:r>
-    </w:p>
-    <w:p>
-      <w:pPr>
-        <w:pStyle w:val="Bullet"/>
-        <w:numPr>
-          <w:ilvl w:val="1"/>
-          <w:numId w:val="90"/>
-        </w:numPr>
-      </w:pPr>
-      <w:r>
-        <w:rPr/>
-        <w:t>Zone of cell division contains primary meristems.</w:t>
-      </w:r>
-    </w:p>
-    <w:p>
-      <w:pPr>
-        <w:pStyle w:val="Bullet"/>
-        <w:numPr>
-          <w:ilvl w:val="1"/>
-          <w:numId w:val="90"/>
-        </w:numPr>
-      </w:pPr>
-      <w:r>
-        <w:rPr/>
-        <w:t>Zone of elongation contains cells that are lengthening and becoming specialized.</w:t>
-      </w:r>
-    </w:p>
-    <w:p>
-      <w:pPr>
-        <w:pStyle w:val="Bullet"/>
-        <w:numPr>
-          <w:ilvl w:val="1"/>
-          <w:numId w:val="90"/>
-        </w:numPr>
-      </w:pPr>
-      <w:r>
-        <w:rPr/>
-        <w:t>Zone of maturation contains fully differentiated cells.</w:t>
-      </w:r>
-    </w:p>
-    <w:p>
-      <w:pPr>
-        <w:pStyle w:val="Slideheading"/>
-      </w:pPr>
-      <w:bookmarkStart w:id="32" w:name="s243027"/>
-      <w:r>
-        <w:rPr>
-          <w:rStyle w:val="Slidecode"/>
-          <w:b/>
-        </w:rPr>
-        <w:t>24.3.27</w:t>
-      </w:r>
-      <w:r>
-        <w:rPr>
-          <w:b/>
-        </w:rPr>
-        <w:t xml:space="preserve"> Tissues of Eudicot Root</w:t>
-      </w:r>
-      <w:bookmarkEnd w:id="32"/>
-    </w:p>
-    <w:p>
-      <w:pPr>
-        <w:pStyle w:val="Bullet"/>
-        <w:numPr>
-          <w:ilvl w:val="0"/>
-          <w:numId w:val="90"/>
-        </w:numPr>
-      </w:pPr>
-      <w:r>
-        <w:rPr/>
-        <w:t>Epidermis – Outer layer of root</w:t>
-      </w:r>
-    </w:p>
-    <w:p>
-      <w:pPr>
-        <w:pStyle w:val="Bullet"/>
-        <w:numPr>
-          <w:ilvl w:val="0"/>
-          <w:numId w:val="90"/>
-        </w:numPr>
-      </w:pPr>
-      <w:r>
-        <w:rPr/>
-        <w:t>Cortex – Composed of parenchyma cells, allowing water and minerals movement</w:t>
-      </w:r>
-    </w:p>
-    <w:p>
-      <w:pPr>
-        <w:pStyle w:val="Bullet"/>
-        <w:numPr>
-          <w:ilvl w:val="0"/>
-          <w:numId w:val="90"/>
-        </w:numPr>
-      </w:pPr>
-      <w:r>
-        <w:rPr/>
-        <w:t>Endodermis – Forms a boundary between cortex and inner vascular cylinder</w:t>
-      </w:r>
-    </w:p>
-    <w:p>
-      <w:pPr>
-        <w:pStyle w:val="Bullet"/>
-        <w:numPr>
-          <w:ilvl w:val="1"/>
-          <w:numId w:val="90"/>
-        </w:numPr>
-      </w:pPr>
-      <w:r>
-        <w:rPr/>
-        <w:t>Casparian strip is composed of protein lignin and suberin.</w:t>
-      </w:r>
-    </w:p>
-    <w:p>
-      <w:pPr>
-        <w:pStyle w:val="Bullet"/>
-        <w:numPr>
-          <w:ilvl w:val="0"/>
-          <w:numId w:val="90"/>
-        </w:numPr>
-      </w:pPr>
-      <w:r>
-        <w:rPr/>
-        <w:t>Pericycle – Mitotically active and is the starting point for development of branch or lateral roots</w:t>
-      </w:r>
-    </w:p>
-    <w:p>
-      <w:pPr>
-        <w:pStyle w:val="Correction"/>
-      </w:pPr>
-      <w:r>
-        <w:rPr>
-          <w:b/>
-          <w:i/>
-        </w:rPr>
-        <w:t xml:space="preserve">Textbook: </w:t>
-      </w:r>
-      <w:r>
-        <w:rPr/>
-        <w:t>Lignin isn't a protein (the textbook uses the same wording): it's a chemical that hardens cell walls, and suberin is a waxy, waterproof lipid. Together they make the Casparian strip waterproof, so water and minerals must pass through the endodermal cells.</w:t>
-      </w:r>
-    </w:p>
-    <w:p>
-      <w:pPr>
-        <w:pStyle w:val="Slideheading"/>
-      </w:pPr>
-      <w:bookmarkStart w:id="33" w:name="s243028"/>
-      <w:r>
-        <w:rPr>
-          <w:rStyle w:val="Slidecode"/>
-          <w:b/>
-        </w:rPr>
-        <w:t>24.3.28</w:t>
-      </w:r>
-      <w:r>
-        <w:rPr>
-          <w:b/>
-        </w:rPr>
-        <w:t xml:space="preserve"> Eudicot Root Tip</w:t>
-      </w:r>
-      <w:bookmarkEnd w:id="33"/>
-    </w:p>
-    <w:p>
-      <w:pPr>
-        <w:pStyle w:val="Figure"/>
-      </w:pPr>
-      <w:r>
-        <w:rPr>
-          <w:i/>
-        </w:rPr>
-        <w:t xml:space="preserve">Fig: </w:t>
-      </w:r>
-      <w:r>
-        <w:rPr/>
-        <w:t>A) Root tip: Diagram of root tips divides into zone of cell division, zone of elongation, zone of maturation and vascular cylinder on the top. Micrograph of zone of cell division shows multiple procambium, ground meristem, protoderm, root apical meristem protected by root cap and root cap. B) Vascular cylinder: Micrograph of vascular cylinder shows multiple circular endodermis, pericycle, phloem, large circular xylem in center and circular cortex, with epidermis and root hair. C) Casparian strip: Diagram shows layers of xylem, phloem, pericycle, endodermis and Casparian strip, cortex and epidermis with root hair (from where water and minerals flow in and out).</w:t>
-      </w:r>
-    </w:p>
-    <w:p>
-      <w:pPr>
-        <w:pStyle w:val="Slideheading"/>
-      </w:pPr>
-      <w:bookmarkStart w:id="34" w:name="s243029"/>
-      <w:r>
-        <w:rPr>
-          <w:rStyle w:val="Slidecode"/>
-          <w:b/>
-        </w:rPr>
-        <w:t>24.3.29</w:t>
-      </w:r>
-      <w:r>
-        <w:rPr>
-          <w:b/>
-        </w:rPr>
-        <w:t xml:space="preserve"> Branching of a Eudicot Root</w:t>
-      </w:r>
-      <w:bookmarkEnd w:id="34"/>
-    </w:p>
-    <w:p>
-      <w:pPr>
-        <w:pStyle w:val="Figure"/>
-      </w:pPr>
-      <w:r>
-        <w:rPr>
-          <w:i/>
-        </w:rPr>
-        <w:t xml:space="preserve">Fig: </w:t>
-      </w:r>
-      <w:r>
-        <w:rPr/>
-        <w:t>Diagram of branched eudicot root shows a branch root, pericycle, endodermis, cortex in center and vascular tissue in core.</w:t>
-      </w:r>
-    </w:p>
-    <w:p>
-      <w:pPr>
-        <w:pStyle w:val="Figure"/>
-      </w:pPr>
-      <w:r>
-        <w:rPr>
-          <w:i/>
-        </w:rPr>
-        <w:t xml:space="preserve">Textbook caption: </w:t>
-      </w:r>
-      <w:r>
-        <w:rPr/>
-        <w:t>This cross section of a willow, Salix, shows the origination and growth of a branch root from the pericycle.</w:t>
-      </w:r>
-    </w:p>
-    <w:p>
-      <w:pPr>
-        <w:pStyle w:val="Slideheading"/>
-      </w:pPr>
-      <w:bookmarkStart w:id="35" w:name="s243030"/>
-      <w:r>
-        <w:rPr>
-          <w:rStyle w:val="Slidecode"/>
-          <w:b/>
-        </w:rPr>
-        <w:t>24.3.30</w:t>
-      </w:r>
-      <w:r>
-        <w:rPr>
-          <w:b/>
-        </w:rPr>
-        <w:t xml:space="preserve"> Organization of Monocot Roots</w:t>
-      </w:r>
-      <w:bookmarkEnd w:id="35"/>
-    </w:p>
-    <w:p>
-      <w:pPr>
-        <w:pStyle w:val="Bullet"/>
-        <w:numPr>
-          <w:ilvl w:val="0"/>
-          <w:numId w:val="90"/>
-        </w:numPr>
-      </w:pPr>
-      <w:r>
-        <w:rPr/>
-        <w:t>The ground tissue of root’s pith is surrounded by a vascular ring.</w:t>
-      </w:r>
-    </w:p>
-    <w:p>
-      <w:pPr>
-        <w:pStyle w:val="Bullet"/>
-        <w:numPr>
-          <w:ilvl w:val="0"/>
-          <w:numId w:val="90"/>
-        </w:numPr>
-      </w:pPr>
-      <w:r>
-        <w:rPr/>
-        <w:t>They have the same growth zones as eudicot roots, but do not undergo secondary growth.</w:t>
-      </w:r>
-    </w:p>
-    <w:p>
-      <w:pPr>
-        <w:pStyle w:val="Bullet"/>
-        <w:numPr>
-          <w:ilvl w:val="0"/>
-          <w:numId w:val="90"/>
-        </w:numPr>
-      </w:pPr>
-      <w:r>
-        <w:rPr/>
-        <w:t>They have pericycle, endodermis, cortex, and epidermis.</w:t>
-      </w:r>
-    </w:p>
-    <w:p>
-      <w:pPr>
-        <w:pStyle w:val="Slideheading"/>
-      </w:pPr>
-      <w:bookmarkStart w:id="36" w:name="s243031"/>
-      <w:r>
-        <w:rPr>
-          <w:rStyle w:val="Slidecode"/>
-          <w:b/>
-        </w:rPr>
-        <w:t>24.3.31</w:t>
-      </w:r>
-      <w:r>
-        <w:rPr>
-          <w:b/>
-        </w:rPr>
-        <w:t xml:space="preserve"> Monocot Root</w:t>
-      </w:r>
-      <w:bookmarkEnd w:id="36"/>
-    </w:p>
-    <w:p>
-      <w:pPr>
-        <w:pStyle w:val="Figure"/>
-      </w:pPr>
-      <w:r>
-        <w:rPr>
-          <w:i/>
-        </w:rPr>
-        <w:t xml:space="preserve">Fig: </w:t>
-      </w:r>
-      <w:r>
-        <w:rPr/>
-        <w:t>Diagram and micrograph of monocot root shows circular pith, phloem, multiple pericycle, endodermis with Casparian strip, xylem, cortex and epidermis.</w:t>
-      </w:r>
-    </w:p>
-    <w:p>
-      <w:pPr>
-        <w:pStyle w:val="Figure"/>
-      </w:pPr>
-      <w:r>
-        <w:rPr>
-          <w:i/>
-        </w:rPr>
-        <w:t xml:space="preserve">Textbook caption: </w:t>
-      </w:r>
-      <w:r>
-        <w:rPr/>
-        <w:t>In this overall cross section, it is possible to observe that a vascular ring surrounds a central pith.</w:t>
-      </w:r>
-    </w:p>
-    <w:p>
-      <w:pPr>
-        <w:pStyle w:val="Slideheading"/>
-      </w:pPr>
-      <w:bookmarkStart w:id="37" w:name="s243032"/>
-      <w:r>
-        <w:rPr>
-          <w:rStyle w:val="Slidecode"/>
-          <w:b/>
-        </w:rPr>
-        <w:t>24.3.32</w:t>
-      </w:r>
-      <w:r>
-        <w:rPr>
-          <w:b/>
-        </w:rPr>
-        <w:t xml:space="preserve"> Root Diversity</w:t>
-      </w:r>
-      <w:bookmarkEnd w:id="37"/>
-    </w:p>
-    <w:p>
-      <w:pPr>
-        <w:pStyle w:val="Bullet"/>
-        <w:numPr>
-          <w:ilvl w:val="0"/>
-          <w:numId w:val="90"/>
-        </w:numPr>
-      </w:pPr>
-      <w:r>
-        <w:rPr/>
-        <w:t>Primary root (taproot) – Fleshy, long single root, that grows straight down</w:t>
-      </w:r>
-    </w:p>
-    <w:p>
-      <w:pPr>
-        <w:pStyle w:val="Bullet"/>
-        <w:numPr>
-          <w:ilvl w:val="1"/>
-          <w:numId w:val="90"/>
-        </w:numPr>
-      </w:pPr>
-      <w:r>
-        <w:rPr/>
-        <w:t>Stores food</w:t>
-      </w:r>
-    </w:p>
-    <w:p>
-      <w:pPr>
-        <w:pStyle w:val="Bullet"/>
-        <w:numPr>
-          <w:ilvl w:val="0"/>
-          <w:numId w:val="90"/>
-        </w:numPr>
-      </w:pPr>
-      <w:r>
-        <w:rPr/>
-        <w:t>Fibrous root system – Slender roots and lateral branches</w:t>
-      </w:r>
-    </w:p>
-    <w:p>
-      <w:pPr>
-        <w:pStyle w:val="Bullet"/>
-        <w:numPr>
-          <w:ilvl w:val="1"/>
-          <w:numId w:val="90"/>
-        </w:numPr>
-      </w:pPr>
-      <w:r>
-        <w:rPr/>
-        <w:t>Anchors plant to soil</w:t>
-      </w:r>
-    </w:p>
-    <w:p>
-      <w:pPr>
-        <w:pStyle w:val="Bullet"/>
-        <w:numPr>
-          <w:ilvl w:val="1"/>
-          <w:numId w:val="90"/>
-        </w:numPr>
-      </w:pPr>
-      <w:r>
-        <w:rPr/>
-        <w:t>Found in monocots</w:t>
-      </w:r>
-    </w:p>
-    <w:p>
-      <w:pPr>
-        <w:pStyle w:val="Bullet"/>
-        <w:numPr>
-          <w:ilvl w:val="0"/>
-          <w:numId w:val="90"/>
-        </w:numPr>
-      </w:pPr>
-      <w:r>
-        <w:rPr/>
-        <w:t>Some plants have roots that possess a variety of adaptations to better perform their functions.</w:t>
-      </w:r>
-    </w:p>
-    <w:p>
-      <w:pPr>
-        <w:pStyle w:val="Bullet"/>
-        <w:numPr>
-          <w:ilvl w:val="0"/>
-          <w:numId w:val="90"/>
-        </w:numPr>
-      </w:pPr>
-      <w:r>
-        <w:rPr/>
-        <w:t>Improve anchorage to the ground and support in high wind</w:t>
-      </w:r>
-    </w:p>
-    <w:p>
-      <w:pPr>
-        <w:pStyle w:val="Bullet"/>
-        <w:numPr>
-          <w:ilvl w:val="0"/>
-          <w:numId w:val="90"/>
-        </w:numPr>
-      </w:pPr>
-      <w:r>
-        <w:rPr/>
-        <w:t>Store large quantities of carbohydrate</w:t>
-      </w:r>
-    </w:p>
-    <w:p>
-      <w:pPr>
-        <w:pStyle w:val="Bullet"/>
-        <w:numPr>
-          <w:ilvl w:val="0"/>
-          <w:numId w:val="90"/>
-        </w:numPr>
-      </w:pPr>
-      <w:r>
-        <w:rPr/>
-        <w:t>Increase absorption of water, minerals, oxygen, sunlight</w:t>
-      </w:r>
-    </w:p>
-    <w:p>
-      <w:pPr>
-        <w:pStyle w:val="Slideheading"/>
-      </w:pPr>
-      <w:bookmarkStart w:id="38" w:name="s243033"/>
-      <w:r>
-        <w:rPr>
-          <w:rStyle w:val="Slidecode"/>
-          <w:b/>
-        </w:rPr>
-        <w:t>24.3.33</w:t>
-      </w:r>
-      <w:r>
-        <w:rPr>
-          <w:b/>
-        </w:rPr>
-        <w:t xml:space="preserve"> Root Specializations</w:t>
-      </w:r>
-      <w:bookmarkEnd w:id="38"/>
-    </w:p>
-    <w:p>
-      <w:pPr>
-        <w:pStyle w:val="Figure"/>
-      </w:pPr>
-      <w:r>
-        <w:rPr>
-          <w:i/>
-        </w:rPr>
-        <w:t xml:space="preserve">Fig: </w:t>
-      </w:r>
-      <w:r>
-        <w:rPr/>
-        <w:t>Root specialization examples include: roots for storage; prop roots for support; pneumatophores for oxygen; multifunctioning aerial roots.</w:t>
-      </w:r>
-    </w:p>
-    <w:p>
-      <w:pPr>
-        <w:pStyle w:val="Figure"/>
-      </w:pPr>
-      <w:r>
-        <w:rPr>
-          <w:i/>
-        </w:rPr>
-        <w:t xml:space="preserve">Textbook: </w:t>
-      </w:r>
-      <w:r>
-        <w:rPr/>
-        <w:t>a. Sweet potato plants have food storage roots. b. Prop roots (corn) are specialized for support in high winds. c. Pneumatophores (mangrove, bald cypress) extend above the water's surface, so a tree living in water can acquire oxygen. d. The aerial roots of orchids offer physical support, water and nutrient uptake, and in some cases even photosynthesis; English ivy uses aerial roots to climb.</w:t>
-      </w:r>
-    </w:p>
-    <w:p>
-      <w:pPr>
-        <w:pStyle w:val="Slideheading"/>
-      </w:pPr>
-      <w:bookmarkStart w:id="39" w:name="s243034"/>
-      <w:r>
-        <w:rPr>
-          <w:rStyle w:val="Slidecode"/>
-          <w:b/>
-        </w:rPr>
-        <w:t>24.3.34</w:t>
-      </w:r>
-      <w:r>
-        <w:rPr>
-          <w:b/>
-        </w:rPr>
-        <w:t xml:space="preserve"> Root Symbiotic Relationships</w:t>
-      </w:r>
-      <w:bookmarkEnd w:id="39"/>
-    </w:p>
-    <w:p>
-      <w:pPr>
-        <w:pStyle w:val="Bullet"/>
-        <w:numPr>
-          <w:ilvl w:val="0"/>
-          <w:numId w:val="90"/>
-        </w:numPr>
-      </w:pPr>
-      <w:r>
-        <w:rPr/>
-        <w:t>Mycorrhizae:</w:t>
-      </w:r>
-    </w:p>
-    <w:p>
-      <w:pPr>
-        <w:pStyle w:val="Bullet"/>
-        <w:numPr>
-          <w:ilvl w:val="1"/>
-          <w:numId w:val="90"/>
-        </w:numPr>
-      </w:pPr>
-      <w:r>
-        <w:rPr/>
-        <w:t>Mutualistic associations between roots and fungi</w:t>
-      </w:r>
-    </w:p>
-    <w:p>
-      <w:pPr>
-        <w:pStyle w:val="Bullet"/>
-        <w:numPr>
-          <w:ilvl w:val="1"/>
-          <w:numId w:val="90"/>
-        </w:numPr>
-      </w:pPr>
-      <w:r>
-        <w:rPr/>
-        <w:t>Assist in water and mineral extraction</w:t>
-      </w:r>
-    </w:p>
-    <w:p>
-      <w:pPr>
-        <w:pStyle w:val="Bullet"/>
-        <w:numPr>
-          <w:ilvl w:val="0"/>
-          <w:numId w:val="90"/>
-        </w:numPr>
-      </w:pPr>
-      <w:r>
-        <w:rPr/>
-        <w:t>Root nodules:</w:t>
-      </w:r>
-    </w:p>
-    <w:p>
-      <w:pPr>
-        <w:pStyle w:val="Bullet"/>
-        <w:numPr>
-          <w:ilvl w:val="1"/>
-          <w:numId w:val="90"/>
-        </w:numPr>
-      </w:pPr>
-      <w:r>
-        <w:rPr/>
-        <w:t>Contain nitrogen-fixing bacteria</w:t>
-      </w:r>
-    </w:p>
-    <w:p>
-      <w:pPr>
-        <w:pStyle w:val="Bullet"/>
-        <w:numPr>
-          <w:ilvl w:val="2"/>
-          <w:numId w:val="90"/>
-        </w:numPr>
-      </w:pPr>
-      <w:r>
-        <w:rPr/>
-        <w:t>Plants cannot extract nitrogen from air, but bacteria in nodules can take up and reduce atmospheric nitrogen.</w:t>
-      </w:r>
-    </w:p>
-    <w:p>
-      <w:pPr>
-        <w:pStyle w:val="Bullet"/>
-        <w:numPr>
-          <w:ilvl w:val="2"/>
-          <w:numId w:val="90"/>
-        </w:numPr>
-      </w:pPr>
-      <w:r>
-        <w:rPr/>
-        <w:t>Plants get nitrogen from bacteria, which receive carbohydrates from the plant.</w:t>
-      </w:r>
-    </w:p>
-    <w:p>
-      <w:pPr>
-        <w:pStyle w:val="Sectionheading"/>
-      </w:pPr>
-      <w:r>
-        <w:rPr/>
-        <w:t>24.4 Organization and Diversity of Stems</w:t>
-      </w:r>
-    </w:p>
-    <w:p>
-      <w:pPr>
-        <w:pStyle w:val="Pointer"/>
-      </w:pPr>
-      <w:r>
-        <w:rPr/>
-        <w:t xml:space="preserve">Quick guide for this section: page </w:t>
-      </w:r>
-      <w:r>
-        <w:fldChar w:fldCharType="begin"/>
-      </w:r>
-      <w:r>
-        <w:instrText xml:space="preserve"> PAGEREF g244 \h </w:instrText>
-      </w:r>
-      <w:r>
-        <w:fldChar w:fldCharType="separate"/>
-      </w:r>
-      <w:r>
-        <w:t>3</w:t>
-      </w:r>
-      <w:r>
-        <w:fldChar w:fldCharType="end"/>
-      </w:r>
-    </w:p>
-    <w:p>
-      <w:pPr>
-        <w:pStyle w:val="Slideheading"/>
-      </w:pPr>
-      <w:bookmarkStart w:id="40" w:name="s244035"/>
-      <w:r>
-        <w:rPr>
-          <w:rStyle w:val="Slidecode"/>
-          <w:b/>
-        </w:rPr>
-        <w:t>24.4.35</w:t>
-      </w:r>
-      <w:bookmarkEnd w:id="40"/>
-    </w:p>
-    <w:p>
-      <w:pPr>
-        <w:pStyle w:val="Bullet"/>
-        <w:numPr>
-          <w:ilvl w:val="0"/>
-          <w:numId w:val="90"/>
-        </w:numPr>
-      </w:pPr>
-      <w:r>
-        <w:rPr/>
-        <w:t>Anatomy of a woody twig:</w:t>
-      </w:r>
-    </w:p>
-    <w:p>
-      <w:pPr>
-        <w:pStyle w:val="Bullet"/>
-        <w:numPr>
-          <w:ilvl w:val="1"/>
-          <w:numId w:val="90"/>
-        </w:numPr>
-      </w:pPr>
-      <w:r>
-        <w:rPr/>
-        <w:t>Terminal bud contains the shoot tip protected by bud scales.</w:t>
-      </w:r>
-    </w:p>
-    <w:p>
-      <w:pPr>
-        <w:pStyle w:val="Bullet"/>
-        <w:numPr>
-          <w:ilvl w:val="2"/>
-          <w:numId w:val="90"/>
-        </w:numPr>
-      </w:pPr>
-      <w:r>
-        <w:rPr/>
-        <w:t>Each spring, bud scales drop, leaving a scar.</w:t>
-      </w:r>
-    </w:p>
-    <w:p>
-      <w:pPr>
-        <w:pStyle w:val="Bullet"/>
-        <w:numPr>
-          <w:ilvl w:val="2"/>
-          <w:numId w:val="90"/>
-        </w:numPr>
-      </w:pPr>
-      <w:r>
-        <w:rPr/>
-        <w:t>Each scar is one year of growth.</w:t>
-      </w:r>
-    </w:p>
-    <w:p>
-      <w:pPr>
-        <w:pStyle w:val="Bullet"/>
-        <w:numPr>
-          <w:ilvl w:val="1"/>
-          <w:numId w:val="90"/>
-        </w:numPr>
-      </w:pPr>
-      <w:r>
-        <w:rPr/>
-        <w:t>Shoot apical meristem</w:t>
-      </w:r>
-    </w:p>
-    <w:p>
-      <w:pPr>
-        <w:pStyle w:val="Bullet"/>
-        <w:numPr>
-          <w:ilvl w:val="2"/>
-          <w:numId w:val="90"/>
-        </w:numPr>
-      </w:pPr>
-      <w:r>
-        <w:rPr/>
-        <w:t>Produces new cells that elongate and increase stem length</w:t>
-      </w:r>
-    </w:p>
-    <w:p>
-      <w:pPr>
-        <w:pStyle w:val="Bullet"/>
-        <w:numPr>
-          <w:ilvl w:val="2"/>
-          <w:numId w:val="90"/>
-        </w:numPr>
-      </w:pPr>
-      <w:r>
-        <w:rPr/>
-        <w:t>Protected by terminal bud</w:t>
-      </w:r>
-    </w:p>
-    <w:p>
-      <w:pPr>
-        <w:pStyle w:val="Bullet"/>
-        <w:numPr>
-          <w:ilvl w:val="3"/>
-          <w:numId w:val="90"/>
-        </w:numPr>
-      </w:pPr>
-      <w:r>
-        <w:rPr/>
-        <w:t>Enveloped by leaf primordia</w:t>
-      </w:r>
-    </w:p>
-    <w:p>
-      <w:pPr>
-        <w:pStyle w:val="Bullet"/>
-        <w:numPr>
-          <w:ilvl w:val="3"/>
-          <w:numId w:val="90"/>
-        </w:numPr>
-      </w:pPr>
-      <w:r>
-        <w:rPr/>
-        <w:t>Specialized primary meristems</w:t>
-      </w:r>
-    </w:p>
-    <w:p>
-      <w:pPr>
-        <w:pStyle w:val="Bullet"/>
-        <w:numPr>
-          <w:ilvl w:val="4"/>
-          <w:numId w:val="90"/>
-        </w:numPr>
-      </w:pPr>
-      <w:r>
-        <w:rPr/>
-        <w:t>Protoderm – gives rise to the epidermis</w:t>
-      </w:r>
-    </w:p>
-    <w:p>
-      <w:pPr>
-        <w:pStyle w:val="Bullet"/>
-        <w:numPr>
-          <w:ilvl w:val="4"/>
-          <w:numId w:val="90"/>
-        </w:numPr>
-      </w:pPr>
-      <w:r>
-        <w:rPr/>
-        <w:t>Ground Meristem – gives rise to pith and cortex</w:t>
-      </w:r>
-    </w:p>
-    <w:p>
-      <w:pPr>
-        <w:pStyle w:val="Bullet"/>
-        <w:numPr>
-          <w:ilvl w:val="4"/>
-          <w:numId w:val="90"/>
-        </w:numPr>
-      </w:pPr>
-      <w:r>
-        <w:rPr/>
-        <w:t>Procambium – produces primary xylem and phloem</w:t>
-      </w:r>
-    </w:p>
-    <w:p>
-      <w:pPr>
-        <w:pStyle w:val="Bullet"/>
-        <w:numPr>
-          <w:ilvl w:val="2"/>
-          <w:numId w:val="90"/>
-        </w:numPr>
-      </w:pPr>
-      <w:r>
-        <w:rPr/>
-        <w:t>Mature vascular bundles contain vascular cambium.</w:t>
-      </w:r>
-    </w:p>
-    <w:p>
-      <w:pPr>
-        <w:pStyle w:val="Slideheading"/>
-      </w:pPr>
-      <w:bookmarkStart w:id="41" w:name="s244036"/>
-      <w:r>
-        <w:rPr>
-          <w:rStyle w:val="Slidecode"/>
-          <w:b/>
-        </w:rPr>
-        <w:t>24.4.36</w:t>
-      </w:r>
-      <w:r>
-        <w:rPr>
-          <w:b/>
-        </w:rPr>
-        <w:t xml:space="preserve"> Woody Twig</w:t>
-      </w:r>
-      <w:bookmarkEnd w:id="41"/>
-    </w:p>
-    <w:p>
-      <w:pPr>
-        <w:pStyle w:val="Figure"/>
-      </w:pPr>
-      <w:r>
-        <w:rPr>
-          <w:i/>
-        </w:rPr>
-        <w:t xml:space="preserve">Fig: </w:t>
-      </w:r>
-      <w:r>
-        <w:rPr/>
-        <w:t>Diagram shows lenticel, bud scale, terminal budscale scars, nodes, internode, axillary bud, leaf and bundle scars, stem, terminal bud and bud scale.</w:t>
-      </w:r>
-    </w:p>
-    <w:p>
-      <w:pPr>
-        <w:pStyle w:val="Slideheading"/>
-      </w:pPr>
-      <w:bookmarkStart w:id="42" w:name="s244037"/>
-      <w:r>
-        <w:rPr>
-          <w:rStyle w:val="Slidecode"/>
-          <w:b/>
-        </w:rPr>
-        <w:t>24.4.37</w:t>
-      </w:r>
-      <w:r>
-        <w:rPr>
-          <w:b/>
-        </w:rPr>
-        <w:t xml:space="preserve"> Shoot Tip and Primary Meristems</w:t>
-      </w:r>
-      <w:bookmarkEnd w:id="42"/>
-    </w:p>
-    <w:p>
-      <w:pPr>
-        <w:pStyle w:val="Figure"/>
-      </w:pPr>
-      <w:r>
-        <w:rPr>
-          <w:i/>
-        </w:rPr>
-        <w:t xml:space="preserve">Fig: </w:t>
-      </w:r>
-      <w:r>
-        <w:rPr/>
-        <w:t>A) Shoot tip: Diagram of shoot tips divides into three zones. Lower zone: It consists of longitudinal primary xylem and primary phloem. Middle zone: It consists of longitudinal vascular cambium and hemispherical axillary bud. Top zone: It consists of procambium, ground meristem, protoderm, shoot apical meristem and leaf primordium. B) Fate of primary meristems: Three Primary Meristems: It consists of protoderm on the outer radial area, ground meristem in the middle and procambium in the core. C) Primary Tissues: It consists of epidermis on the outermost radial area, cortex in the outer radial area and pith in the center. Enlarged diagram of vascular bundles show circular multiple pith, primary xylem, vascular cambium, primary phloem and cortex.</w:t>
-      </w:r>
-    </w:p>
-    <w:p>
-      <w:pPr>
-        <w:pStyle w:val="Slideheading"/>
-      </w:pPr>
-      <w:bookmarkStart w:id="43" w:name="s244038"/>
-      <w:r>
-        <w:rPr>
-          <w:rStyle w:val="Slidecode"/>
-          <w:b/>
-        </w:rPr>
-        <w:t>24.4.38</w:t>
-      </w:r>
-      <w:r>
-        <w:rPr>
-          <w:b/>
-        </w:rPr>
-        <w:t xml:space="preserve"> Herbaceous Stems</w:t>
-      </w:r>
-      <w:bookmarkEnd w:id="43"/>
-    </w:p>
-    <w:p>
-      <w:pPr>
-        <w:pStyle w:val="Bullet"/>
-        <w:numPr>
-          <w:ilvl w:val="0"/>
-          <w:numId w:val="90"/>
-        </w:numPr>
-      </w:pPr>
-      <w:r>
-        <w:rPr/>
-        <w:t>Mature, nonwoody stems exhibit only primary growth.</w:t>
-      </w:r>
-    </w:p>
-    <w:p>
-      <w:pPr>
-        <w:pStyle w:val="Bullet"/>
-        <w:numPr>
-          <w:ilvl w:val="1"/>
-          <w:numId w:val="90"/>
-        </w:numPr>
-      </w:pPr>
-      <w:r>
-        <w:rPr/>
-        <w:t>Outermost tissue is covered with waxy cuticle.</w:t>
-      </w:r>
-    </w:p>
-    <w:p>
-      <w:pPr>
-        <w:pStyle w:val="Bullet"/>
-        <w:numPr>
-          <w:ilvl w:val="1"/>
-          <w:numId w:val="90"/>
-        </w:numPr>
-      </w:pPr>
-      <w:r>
-        <w:rPr/>
-        <w:t>Stems have distinctive vascular bundles.</w:t>
-      </w:r>
-    </w:p>
-    <w:p>
-      <w:pPr>
-        <w:pStyle w:val="Bullet"/>
-        <w:numPr>
-          <w:ilvl w:val="2"/>
-          <w:numId w:val="90"/>
-        </w:numPr>
-      </w:pPr>
-      <w:r>
-        <w:rPr/>
-        <w:t>Herbaceous eudicots – vascular bundles arranged in distinct ring</w:t>
-      </w:r>
-    </w:p>
-    <w:p>
-      <w:pPr>
-        <w:pStyle w:val="Bullet"/>
-        <w:numPr>
-          <w:ilvl w:val="2"/>
-          <w:numId w:val="90"/>
-        </w:numPr>
-      </w:pPr>
-      <w:r>
-        <w:rPr/>
-        <w:t>Monocots – vascular bundles scattered throughout stem</w:t>
-      </w:r>
-    </w:p>
-    <w:p>
-      <w:pPr>
-        <w:pStyle w:val="Slideheading"/>
-      </w:pPr>
-      <w:bookmarkStart w:id="44" w:name="s244039"/>
-      <w:r>
-        <w:rPr>
-          <w:rStyle w:val="Slidecode"/>
-          <w:b/>
-        </w:rPr>
-        <w:t>24.4.39</w:t>
-      </w:r>
-      <w:r>
-        <w:rPr>
-          <w:b/>
-        </w:rPr>
-        <w:t xml:space="preserve"> Herbaceous Eudicot Stem</w:t>
-      </w:r>
-      <w:bookmarkEnd w:id="44"/>
-    </w:p>
-    <w:p>
-      <w:pPr>
-        <w:pStyle w:val="Figure"/>
-      </w:pPr>
-      <w:r>
-        <w:rPr>
-          <w:i/>
-        </w:rPr>
-        <w:t xml:space="preserve">Fig: </w:t>
-      </w:r>
-      <w:r>
-        <w:rPr/>
-        <w:t>Left panel: Diagram of herbaceous eudicot stem consists of cluster of pith in the center with cortex and epidermis. Right panel: Enlarged diagram of vascular bundles show circular multiple xylem, phloem, phloem fiber, circular pith, vascular cambium with set layers of parenchyma cells, collenchyma cells, and epidermis.</w:t>
-      </w:r>
-    </w:p>
-    <w:p>
-      <w:pPr>
-        <w:pStyle w:val="Slideheading"/>
-      </w:pPr>
-      <w:bookmarkStart w:id="45" w:name="s244040"/>
-      <w:r>
-        <w:rPr>
-          <w:rStyle w:val="Slidecode"/>
-          <w:b/>
-        </w:rPr>
-        <w:t>24.4.40</w:t>
-      </w:r>
-      <w:r>
-        <w:rPr>
-          <w:b/>
-        </w:rPr>
-        <w:t xml:space="preserve"> Monocot Stem</w:t>
-      </w:r>
-      <w:bookmarkEnd w:id="45"/>
-    </w:p>
-    <w:p>
-      <w:pPr>
-        <w:pStyle w:val="Figure"/>
-      </w:pPr>
-      <w:r>
-        <w:rPr>
-          <w:i/>
-        </w:rPr>
-        <w:t xml:space="preserve">Fig: </w:t>
-      </w:r>
-      <w:r>
-        <w:rPr/>
-        <w:t>Top panel: Micrograph shows ovular vascular bundles, ground tissue and epidermis. Right panel: Enlarged diagram of vascular bundle shows different sized circular layers of ground tissue (parenchyma), xylem, phloem, bundle sheath cells, sieve-tube member, air space, companion cell, and vessel element.</w:t>
-      </w:r>
-    </w:p>
-    <w:p>
-      <w:pPr>
-        <w:pStyle w:val="Slideheading"/>
-      </w:pPr>
-      <w:bookmarkStart w:id="46" w:name="s244041"/>
-      <w:r>
-        <w:rPr>
-          <w:rStyle w:val="Slidecode"/>
-          <w:b/>
-        </w:rPr>
-        <w:t>24.4.41</w:t>
-      </w:r>
-      <w:r>
-        <w:rPr>
-          <w:b/>
-        </w:rPr>
-        <w:t xml:space="preserve"> Woody Stems</w:t>
-      </w:r>
-      <w:bookmarkEnd w:id="46"/>
-    </w:p>
-    <w:p>
-      <w:pPr>
-        <w:pStyle w:val="Bullet"/>
-        <w:numPr>
-          <w:ilvl w:val="0"/>
-          <w:numId w:val="90"/>
-        </w:numPr>
-      </w:pPr>
-      <w:r>
-        <w:rPr/>
-        <w:t>Woody plants have both primary and secondary tissues.</w:t>
-      </w:r>
-    </w:p>
-    <w:p>
-      <w:pPr>
-        <w:pStyle w:val="Bullet"/>
-        <w:numPr>
-          <w:ilvl w:val="2"/>
-          <w:numId w:val="90"/>
-        </w:numPr>
-      </w:pPr>
-      <w:r>
-        <w:rPr/>
-        <w:t>Primary tissues form each year from primary meristems.</w:t>
-      </w:r>
-    </w:p>
-    <w:p>
-      <w:pPr>
-        <w:pStyle w:val="Bullet"/>
-        <w:numPr>
-          <w:ilvl w:val="2"/>
-          <w:numId w:val="90"/>
-        </w:numPr>
-      </w:pPr>
-      <w:r>
-        <w:rPr/>
-        <w:t>Secondary tissues develop during first and subsequent years from lateral meristems.</w:t>
-      </w:r>
-    </w:p>
-    <w:p>
-      <w:pPr>
-        <w:pStyle w:val="Slideheading"/>
-      </w:pPr>
-      <w:bookmarkStart w:id="47" w:name="s244042"/>
-      <w:r>
-        <w:rPr>
-          <w:rStyle w:val="Slidecode"/>
-          <w:b/>
-        </w:rPr>
-        <w:t>24.4.42</w:t>
-      </w:r>
-      <w:r>
-        <w:rPr>
-          <w:b/>
-        </w:rPr>
-        <w:t xml:space="preserve"> Woody Stem Characteristics</w:t>
-      </w:r>
-      <w:bookmarkEnd w:id="47"/>
-    </w:p>
-    <w:p>
-      <w:pPr>
-        <w:pStyle w:val="Bullet"/>
-        <w:numPr>
-          <w:ilvl w:val="0"/>
-          <w:numId w:val="90"/>
-        </w:numPr>
-      </w:pPr>
-      <w:r>
-        <w:rPr/>
-        <w:t>Woody stems have both primary and secondary growth.</w:t>
-      </w:r>
-    </w:p>
-    <w:p>
-      <w:pPr>
-        <w:pStyle w:val="Bullet"/>
-        <w:numPr>
-          <w:ilvl w:val="1"/>
-          <w:numId w:val="90"/>
-        </w:numPr>
-      </w:pPr>
-      <w:r>
-        <w:rPr/>
-        <w:t>Primary growth increases the length of the plant.</w:t>
-      </w:r>
-    </w:p>
-    <w:p>
-      <w:pPr>
-        <w:pStyle w:val="Bullet"/>
-        <w:numPr>
-          <w:ilvl w:val="1"/>
-          <w:numId w:val="90"/>
-        </w:numPr>
-      </w:pPr>
-      <w:r>
-        <w:rPr/>
-        <w:t>Secondary growth increases the girth.</w:t>
-      </w:r>
-    </w:p>
-    <w:p>
-      <w:pPr>
-        <w:pStyle w:val="Bullet"/>
-        <w:numPr>
-          <w:ilvl w:val="0"/>
-          <w:numId w:val="90"/>
-        </w:numPr>
-      </w:pPr>
-      <w:r>
-        <w:rPr/>
-        <w:t>Woody stems have no vascular tissue, and instead have three distinct regions.</w:t>
-      </w:r>
-    </w:p>
-    <w:p>
-      <w:pPr>
-        <w:pStyle w:val="Bullet"/>
-        <w:numPr>
-          <w:ilvl w:val="1"/>
-          <w:numId w:val="90"/>
-        </w:numPr>
-      </w:pPr>
-      <w:r>
-        <w:rPr/>
-        <w:t>Bark</w:t>
-      </w:r>
-    </w:p>
-    <w:p>
-      <w:pPr>
-        <w:pStyle w:val="Bullet"/>
-        <w:numPr>
-          <w:ilvl w:val="1"/>
-          <w:numId w:val="90"/>
-        </w:numPr>
-      </w:pPr>
-      <w:r>
-        <w:rPr/>
-        <w:t>Pith</w:t>
-      </w:r>
-    </w:p>
-    <w:p>
-      <w:pPr>
-        <w:pStyle w:val="Correction"/>
-      </w:pPr>
-      <w:r>
-        <w:rPr>
-          <w:b/>
-          <w:i/>
-        </w:rPr>
-        <w:t xml:space="preserve">Textbook: </w:t>
-      </w:r>
-      <w:r>
-        <w:rPr/>
-        <w:t>Woody stems are mostly vascular tissue: wood is secondary xylem, and bark contains secondary phloem (24.4.43–45). The three regions are bark, wood and pith (the slide leaves out wood). The professor confirmed this slide is wrong (Oct 22).</w:t>
-      </w:r>
-    </w:p>
-    <w:p>
-      <w:pPr>
-        <w:pStyle w:val="Slideheading"/>
-      </w:pPr>
-      <w:bookmarkStart w:id="48" w:name="s244043"/>
-      <w:r>
-        <w:rPr>
-          <w:rStyle w:val="Slidecode"/>
-          <w:b/>
-        </w:rPr>
-        <w:t>24.4.43</w:t>
-      </w:r>
-      <w:r>
-        <w:rPr>
-          <w:b/>
-        </w:rPr>
-        <w:t xml:space="preserve"> Diagrams of Secondary Growth of Stems</w:t>
-      </w:r>
-      <w:bookmarkEnd w:id="48"/>
-    </w:p>
-    <w:p>
-      <w:pPr>
-        <w:pStyle w:val="Figure"/>
-      </w:pPr>
-      <w:r>
-        <w:rPr>
-          <w:i/>
-        </w:rPr>
-        <w:t xml:space="preserve">Fig: </w:t>
-      </w:r>
-      <w:r>
-        <w:rPr/>
-        <w:t>Vascular cambium: lateral meristem that will produce secondary xylem and secondary phloem in each succeeding year. Periderm: As a stem becomes woody, epidermis is replaced by the periderm. Bark: includes periderm and living secondary phloem. Wood: Increases each year; includes annual rings of xylem.</w:t>
-      </w:r>
-    </w:p>
-    <w:p>
-      <w:pPr>
-        <w:pStyle w:val="Slideheading"/>
-      </w:pPr>
-      <w:bookmarkStart w:id="49" w:name="s244044"/>
-      <w:r>
-        <w:rPr>
-          <w:rStyle w:val="Slidecode"/>
-          <w:b/>
-        </w:rPr>
-        <w:t>24.4.44</w:t>
-      </w:r>
-      <w:r>
-        <w:rPr>
-          <w:b/>
-        </w:rPr>
-        <w:t xml:space="preserve"> Bark</w:t>
-      </w:r>
-      <w:bookmarkEnd w:id="49"/>
-    </w:p>
-    <w:p>
-      <w:pPr>
-        <w:pStyle w:val="Bullet"/>
-        <w:numPr>
-          <w:ilvl w:val="0"/>
-          <w:numId w:val="90"/>
-        </w:numPr>
-      </w:pPr>
-      <w:r>
-        <w:rPr/>
-        <w:t>Bark of a tree contains cork, cork cambium, cortex, and phloem.</w:t>
-      </w:r>
-    </w:p>
-    <w:p>
-      <w:pPr>
-        <w:pStyle w:val="Bullet"/>
-        <w:numPr>
-          <w:ilvl w:val="0"/>
-          <w:numId w:val="90"/>
-        </w:numPr>
-      </w:pPr>
-      <w:r>
-        <w:rPr/>
-        <w:t>Bark can be removed, but it is harmful to the plant due to lack of organic nutrient transport.</w:t>
-      </w:r>
-    </w:p>
-    <w:p>
-      <w:pPr>
-        <w:pStyle w:val="Bullet"/>
-        <w:numPr>
-          <w:ilvl w:val="0"/>
-          <w:numId w:val="90"/>
-        </w:numPr>
-      </w:pPr>
-      <w:r>
-        <w:rPr/>
-        <w:t>Girdling, removing bark from around the tree, leads to the death of the tree.</w:t>
-      </w:r>
-    </w:p>
-    <w:p>
-      <w:pPr>
-        <w:pStyle w:val="Bullet"/>
-        <w:numPr>
-          <w:ilvl w:val="0"/>
-          <w:numId w:val="90"/>
-        </w:numPr>
-      </w:pPr>
-      <w:r>
-        <w:rPr/>
-        <w:t>Cork cells are impregnated with suberin.</w:t>
-      </w:r>
-    </w:p>
-    <w:p>
-      <w:pPr>
-        <w:pStyle w:val="Bullet"/>
-        <w:numPr>
-          <w:ilvl w:val="1"/>
-          <w:numId w:val="90"/>
-        </w:numPr>
-      </w:pPr>
-      <w:r>
-        <w:rPr/>
-        <w:t>Gas exchange is impeded except at lenticels.</w:t>
-      </w:r>
-    </w:p>
-    <w:p>
-      <w:pPr>
-        <w:pStyle w:val="Slideheading"/>
-      </w:pPr>
-      <w:bookmarkStart w:id="50" w:name="s244045"/>
-      <w:r>
-        <w:rPr>
-          <w:rStyle w:val="Slidecode"/>
-          <w:b/>
-        </w:rPr>
-        <w:t>24.4.45</w:t>
-      </w:r>
-      <w:r>
-        <w:rPr>
-          <w:b/>
-        </w:rPr>
-        <w:t xml:space="preserve"> Wood</w:t>
-      </w:r>
-      <w:bookmarkEnd w:id="50"/>
-    </w:p>
-    <w:p>
-      <w:pPr>
-        <w:pStyle w:val="Bullet"/>
-        <w:numPr>
-          <w:ilvl w:val="0"/>
-          <w:numId w:val="90"/>
-        </w:numPr>
-      </w:pPr>
-      <w:r>
-        <w:rPr/>
-        <w:t>Wood is secondary xylem that builds up year after year.</w:t>
-      </w:r>
-    </w:p>
-    <w:p>
-      <w:pPr>
-        <w:pStyle w:val="Bullet"/>
-        <w:numPr>
-          <w:ilvl w:val="1"/>
-          <w:numId w:val="90"/>
-        </w:numPr>
-      </w:pPr>
-      <w:r>
-        <w:rPr/>
-        <w:t>Vascular cambium is dormant during winter.</w:t>
-      </w:r>
-    </w:p>
-    <w:p>
-      <w:pPr>
-        <w:pStyle w:val="Bullet"/>
-        <w:numPr>
-          <w:ilvl w:val="1"/>
-          <w:numId w:val="90"/>
-        </w:numPr>
-      </w:pPr>
-      <w:r>
-        <w:rPr/>
-        <w:t>Annual ring is made up of spring wood and summer wood.</w:t>
-      </w:r>
-    </w:p>
-    <w:p>
-      <w:pPr>
-        <w:pStyle w:val="Bullet"/>
-        <w:numPr>
-          <w:ilvl w:val="2"/>
-          <w:numId w:val="90"/>
-        </w:numPr>
-      </w:pPr>
-      <w:r>
-        <w:rPr/>
-        <w:t>Summer wood has a lower proportion of vessels than spring wood.</w:t>
-      </w:r>
-    </w:p>
-    <w:p>
-      <w:pPr>
-        <w:pStyle w:val="Bullet"/>
-        <w:numPr>
-          <w:ilvl w:val="0"/>
-          <w:numId w:val="90"/>
-        </w:numPr>
-      </w:pPr>
-      <w:r>
-        <w:rPr/>
         <w:t>In older trees, inner annual rings, called heartwood, no longer function in water transport.</w:t>
       </w:r>
     </w:p>
@@ -6258,19 +6245,6 @@
         <w:t xml:space="preserve"> Three-Year-Old Woody Twig</w:t>
       </w:r>
       <w:bookmarkEnd w:id="51"/>
-    </w:p>
-    <w:p>
-      <w:pPr>
-        <w:pStyle w:val="Bullet"/>
-        <w:numPr>
-          <w:ilvl w:val="0"/>
-          <w:numId w:val="90"/>
-        </w:numPr>
-      </w:pPr>
-      <w:r>
-        <w:rPr/>
-        <w:t>(photo) (circular cross section): Ed Reschke/Stone/Getty Images</w:t>
-      </w:r>
     </w:p>
     <w:p>
       <w:pPr>

</xml_diff>